<commit_message>
Contrato: el cliente pasa a ser Libre G Platforms LLC y el anexo A deja de ser lista de tareas
- Comparecencia con la LLC de Wyoming, su representante legal y su
  representante autorizado, que firman los dos.
- La publicación empieza el 9 de octubre; Caracas Rock sale del contrato.
- El anexo A recoge entregables (entregados, por completar y mensuales)
  en lugar del seguimiento de tareas; las consultas técnicas tienen
  cinco días hábiles de respuesta.
- Fuera las metas de pre-lanzamiento, que ya no aplican.
Los datos de identificación siguen solo en el JSON local, fuera de git.

Co-Authored-By: Claude Opus 5.5 <noreply@anthropic.com>
Claude-Session: https://claude.ai/code/session_01Qy8RH9HpcCovm8m9XGHqK7
</commit_message>
<xml_diff>
--- a/contrato/Contrato Organic Club - Kenia (plantilla).docx
+++ b/contrato/Contrato Organic Club - Kenia (plantilla).docx
@@ -203,7 +203,7 @@
                 <w:sz w:val="19"/>
                 <w:szCs w:val="19"/>
               </w:rPr>
-              <w:t xml:space="preserve">Ninro Libre — fundador y CEO de Kenia</w:t>
+              <w:t xml:space="preserve">LIBRE G PLATFORMS LLC — titular de la aplicación Kenia</w:t>
             </w:r>
           </w:p>
         </w:tc>
@@ -236,7 +236,7 @@
                 <w:sz w:val="19"/>
                 <w:szCs w:val="19"/>
               </w:rPr>
-              <w:t xml:space="preserve">La agencia</w:t>
+              <w:t xml:space="preserve">Representante legal</w:t>
             </w:r>
           </w:p>
         </w:tc>
@@ -262,7 +262,7 @@
                 <w:sz w:val="19"/>
                 <w:szCs w:val="19"/>
               </w:rPr>
-              <w:t xml:space="preserve">Organic Club — Liam Libre y Alonzo García</w:t>
+              <w:t xml:space="preserve">Ninro Alexander Libre Guerrero — fundador y CEO de Kenia</w:t>
             </w:r>
           </w:p>
         </w:tc>
@@ -295,7 +295,7 @@
                 <w:sz w:val="19"/>
                 <w:szCs w:val="19"/>
               </w:rPr>
-              <w:t xml:space="preserve">Contacto técnico del cliente</w:t>
+              <w:t xml:space="preserve">Representante autorizado</w:t>
             </w:r>
           </w:p>
         </w:tc>
@@ -321,7 +321,7 @@
                 <w:sz w:val="19"/>
                 <w:szCs w:val="19"/>
               </w:rPr>
-              <w:t xml:space="preserve">Kurt — desarrollador de la aplicación</w:t>
+              <w:t xml:space="preserve">Kurt A. Libre C. — desarrollador y contacto técnico</w:t>
             </w:r>
           </w:p>
         </w:tc>
@@ -354,7 +354,7 @@
                 <w:sz w:val="19"/>
                 <w:szCs w:val="19"/>
               </w:rPr>
-              <w:t xml:space="preserve">Inicio de los servicios</w:t>
+              <w:t xml:space="preserve">La agencia</w:t>
             </w:r>
           </w:p>
         </w:tc>
@@ -380,7 +380,7 @@
                 <w:sz w:val="19"/>
                 <w:szCs w:val="19"/>
               </w:rPr>
-              <w:t xml:space="preserve">1 de septiembre de 2026</w:t>
+              <w:t xml:space="preserve">Organic Club — Liam Libre y Alonzo García</w:t>
             </w:r>
           </w:p>
         </w:tc>
@@ -413,7 +413,7 @@
                 <w:sz w:val="19"/>
                 <w:szCs w:val="19"/>
               </w:rPr>
-              <w:t xml:space="preserve">Plazo inicial</w:t>
+              <w:t xml:space="preserve">Inicio de los servicios</w:t>
             </w:r>
           </w:p>
         </w:tc>
@@ -439,7 +439,7 @@
                 <w:sz w:val="19"/>
                 <w:szCs w:val="19"/>
               </w:rPr>
-              <w:t xml:space="preserve">Hasta el 31 de diciembre de 2026, renovable mes a mes</w:t>
+              <w:t xml:space="preserve">1 de septiembre de 2026</w:t>
             </w:r>
           </w:p>
         </w:tc>
@@ -472,7 +472,7 @@
                 <w:sz w:val="19"/>
                 <w:szCs w:val="19"/>
               </w:rPr>
-              <w:t xml:space="preserve">Honorarios</w:t>
+              <w:t xml:space="preserve">Inicio de la publicación</w:t>
             </w:r>
           </w:p>
         </w:tc>
@@ -498,7 +498,7 @@
                 <w:sz w:val="19"/>
                 <w:szCs w:val="19"/>
               </w:rPr>
-              <w:t xml:space="preserve">US$ 1.000 el primer mes · US$ 1.200 mensuales desde el segundo</w:t>
+              <w:t xml:space="preserve">9 de octubre de 2026</w:t>
             </w:r>
           </w:p>
         </w:tc>
@@ -531,7 +531,7 @@
                 <w:sz w:val="19"/>
                 <w:szCs w:val="19"/>
               </w:rPr>
-              <w:t xml:space="preserve">Lugar y fecha de firma</w:t>
+              <w:t xml:space="preserve">Plazo inicial</w:t>
             </w:r>
           </w:p>
         </w:tc>
@@ -557,6 +557,124 @@
                 <w:sz w:val="19"/>
                 <w:szCs w:val="19"/>
               </w:rPr>
+              <w:t xml:space="preserve">Hasta el 31 de diciembre de 2026, renovable mes a mes</w:t>
+            </w:r>
+          </w:p>
+        </w:tc>
+      </w:tr>
+      <w:tr>
+        <w:trPr>
+          <w:cantSplit/>
+        </w:trPr>
+        <w:tc>
+          <w:tcPr>
+            <w:tcW w:type="dxa" w:w="3000"/>
+            <w:shd w:fill="F2F6F7" w:color="auto" w:val="clear"/>
+            <w:tcMar>
+              <w:top w:type="dxa" w:w="100"/>
+              <w:left w:type="dxa" w:w="140"/>
+              <w:bottom w:type="dxa" w:w="100"/>
+              <w:right w:type="dxa" w:w="140"/>
+            </w:tcMar>
+          </w:tcPr>
+          <w:p>
+            <w:pPr>
+              <w:spacing w:after="0" w:line="264"/>
+            </w:pPr>
+            <w:r>
+              <w:rPr>
+                <w:rFonts w:ascii="Calibri" w:cs="Calibri" w:eastAsia="Calibri" w:hAnsi="Calibri"/>
+                <w:b/>
+                <w:bCs/>
+                <w:color w:val="1B1B1B"/>
+                <w:sz w:val="19"/>
+                <w:szCs w:val="19"/>
+              </w:rPr>
+              <w:t xml:space="preserve">Honorarios</w:t>
+            </w:r>
+          </w:p>
+        </w:tc>
+        <w:tc>
+          <w:tcPr>
+            <w:tcW w:type="dxa" w:w="6648"/>
+            <w:shd w:fill="F2F6F7" w:color="auto" w:val="clear"/>
+            <w:tcMar>
+              <w:top w:type="dxa" w:w="100"/>
+              <w:left w:type="dxa" w:w="140"/>
+              <w:bottom w:type="dxa" w:w="100"/>
+              <w:right w:type="dxa" w:w="140"/>
+            </w:tcMar>
+          </w:tcPr>
+          <w:p>
+            <w:pPr>
+              <w:spacing w:after="0" w:line="264"/>
+            </w:pPr>
+            <w:r>
+              <w:rPr>
+                <w:rFonts w:ascii="Calibri" w:cs="Calibri" w:eastAsia="Calibri" w:hAnsi="Calibri"/>
+                <w:color w:val="1B1B1B"/>
+                <w:sz w:val="19"/>
+                <w:szCs w:val="19"/>
+              </w:rPr>
+              <w:t xml:space="preserve">US$ 1.000 el primer mes · US$ 1.200 mensuales desde el segundo</w:t>
+            </w:r>
+          </w:p>
+        </w:tc>
+      </w:tr>
+      <w:tr>
+        <w:trPr>
+          <w:cantSplit/>
+        </w:trPr>
+        <w:tc>
+          <w:tcPr>
+            <w:tcW w:type="dxa" w:w="3000"/>
+            <w:shd w:fill="FFFFFF" w:color="auto" w:val="clear"/>
+            <w:tcMar>
+              <w:top w:type="dxa" w:w="100"/>
+              <w:left w:type="dxa" w:w="140"/>
+              <w:bottom w:type="dxa" w:w="100"/>
+              <w:right w:type="dxa" w:w="140"/>
+            </w:tcMar>
+          </w:tcPr>
+          <w:p>
+            <w:pPr>
+              <w:spacing w:after="0" w:line="264"/>
+            </w:pPr>
+            <w:r>
+              <w:rPr>
+                <w:rFonts w:ascii="Calibri" w:cs="Calibri" w:eastAsia="Calibri" w:hAnsi="Calibri"/>
+                <w:b/>
+                <w:bCs/>
+                <w:color w:val="1B1B1B"/>
+                <w:sz w:val="19"/>
+                <w:szCs w:val="19"/>
+              </w:rPr>
+              <w:t xml:space="preserve">Lugar y fecha de firma</w:t>
+            </w:r>
+          </w:p>
+        </w:tc>
+        <w:tc>
+          <w:tcPr>
+            <w:tcW w:type="dxa" w:w="6648"/>
+            <w:shd w:fill="FFFFFF" w:color="auto" w:val="clear"/>
+            <w:tcMar>
+              <w:top w:type="dxa" w:w="100"/>
+              <w:left w:type="dxa" w:w="140"/>
+              <w:bottom w:type="dxa" w:w="100"/>
+              <w:right w:type="dxa" w:w="140"/>
+            </w:tcMar>
+          </w:tcPr>
+          <w:p>
+            <w:pPr>
+              <w:spacing w:after="0" w:line="264"/>
+            </w:pPr>
+            <w:r>
+              <w:rPr>
+                <w:rFonts w:ascii="Calibri" w:cs="Calibri" w:eastAsia="Calibri" w:hAnsi="Calibri"/>
+                <w:color w:val="1B1B1B"/>
+                <w:sz w:val="19"/>
+                <w:szCs w:val="19"/>
+              </w:rPr>
               <w:t xml:space="preserve">Caracas, 4 de octubre de 2026</w:t>
             </w:r>
           </w:p>
@@ -600,7 +718,7 @@
           <w:sz w:val="21"/>
           <w:szCs w:val="21"/>
         </w:rPr>
-        <w:t xml:space="preserve">, recoge el cronograma real del proyecto y fija el alcance, los plazos, los honorarios y las condiciones de pago que regirán a partir de su firma.</w:t>
+        <w:t xml:space="preserve">, recoge el cronograma real del proyecto y fija el alcance, los entregables, los honorarios y las condiciones de pago que regirán a partir de su firma.</w:t>
       </w:r>
     </w:p>
     <w:p>
@@ -650,16 +768,16 @@
           <w:sz w:val="21"/>
           <w:szCs w:val="21"/>
         </w:rPr>
-        <w:t xml:space="preserve">NINRO LIBRE</w:t>
-      </w:r>
-      <w:r>
-        <w:rPr>
-          <w:rFonts w:ascii="Calibri" w:cs="Calibri" w:eastAsia="Calibri" w:hAnsi="Calibri"/>
-          <w:color w:val="1B1B1B"/>
-          <w:sz w:val="21"/>
-          <w:szCs w:val="21"/>
-        </w:rPr>
-        <w:t xml:space="preserve">, de nacionalidad __________, mayor de edad, titular de la cédula de identidad N.º ____________________, con domicilio en ________________________________, teléfono ____________________ y correo electrónico ____________________, quien actúa en su propio nombre y en su carácter de fundador y titular del proyecto y de la aplicación móvil denominada </w:t>
+        <w:t xml:space="preserve">LIBRE G PLATFORMS LLC</w:t>
+      </w:r>
+      <w:r>
+        <w:rPr>
+          <w:rFonts w:ascii="Calibri" w:cs="Calibri" w:eastAsia="Calibri" w:hAnsi="Calibri"/>
+          <w:color w:val="1B1B1B"/>
+          <w:sz w:val="21"/>
+          <w:szCs w:val="21"/>
+        </w:rPr>
+        <w:t xml:space="preserve">, sociedad de responsabilidad limitada constituida conforme a las leyes del Estado de Wyoming, Estados Unidos de América, identificada con el EIN N.º ____________________, con domicilio en ________________________________, titular de la aplicación móvil denominada </w:t>
       </w:r>
       <w:r>
         <w:rPr>
@@ -679,7 +797,47 @@
           <w:sz w:val="21"/>
           <w:szCs w:val="21"/>
         </w:rPr>
-        <w:t xml:space="preserve">, quien en lo sucesivo y a los efectos de este contrato se denominará </w:t>
+        <w:t xml:space="preserve">, representada en este acto por su representante legal, </w:t>
+      </w:r>
+      <w:r>
+        <w:rPr>
+          <w:rFonts w:ascii="Calibri" w:cs="Calibri" w:eastAsia="Calibri" w:hAnsi="Calibri"/>
+          <w:b/>
+          <w:bCs/>
+          <w:color w:val="1B1B1B"/>
+          <w:sz w:val="21"/>
+          <w:szCs w:val="21"/>
+        </w:rPr>
+        <w:t xml:space="preserve">NINRO ALEXANDER LIBRE GUERRERO</w:t>
+      </w:r>
+      <w:r>
+        <w:rPr>
+          <w:rFonts w:ascii="Calibri" w:cs="Calibri" w:eastAsia="Calibri" w:hAnsi="Calibri"/>
+          <w:color w:val="1B1B1B"/>
+          <w:sz w:val="21"/>
+          <w:szCs w:val="21"/>
+        </w:rPr>
+        <w:t xml:space="preserve">, mayor de edad, titular de la cédula de identidad N.º ____________________, con domicilio en ________________________________, y por su representante autorizado, </w:t>
+      </w:r>
+      <w:r>
+        <w:rPr>
+          <w:rFonts w:ascii="Calibri" w:cs="Calibri" w:eastAsia="Calibri" w:hAnsi="Calibri"/>
+          <w:b/>
+          <w:bCs/>
+          <w:color w:val="1B1B1B"/>
+          <w:sz w:val="21"/>
+          <w:szCs w:val="21"/>
+        </w:rPr>
+        <w:t xml:space="preserve">KURT A. LIBRE C.</w:t>
+      </w:r>
+      <w:r>
+        <w:rPr>
+          <w:rFonts w:ascii="Calibri" w:cs="Calibri" w:eastAsia="Calibri" w:hAnsi="Calibri"/>
+          <w:color w:val="1B1B1B"/>
+          <w:sz w:val="21"/>
+          <w:szCs w:val="21"/>
+        </w:rPr>
+        <w:t xml:space="preserve">, mayor de edad, titular de la cédula de identidad N.º ____________________, con domicilio en ________________________________; sociedad que en lo sucesivo y a los efectos de este contrato se denominará </w:t>
       </w:r>
       <w:r>
         <w:rPr>
@@ -734,7 +892,7 @@
           <w:sz w:val="21"/>
           <w:szCs w:val="21"/>
         </w:rPr>
-        <w:t xml:space="preserve">, de nacionalidad __________, mayor de edad, titular de la cédula de identidad N.º ____________________, con domicilio en ________________________________, teléfono ____________________ y correo electrónico ____________________; y </w:t>
+        <w:t xml:space="preserve">, mayor de edad, titular de la cédula de identidad N.º ____________________, con domicilio en ________________________________; y </w:t>
       </w:r>
       <w:r>
         <w:rPr>
@@ -754,7 +912,7 @@
           <w:sz w:val="21"/>
           <w:szCs w:val="21"/>
         </w:rPr>
-        <w:t xml:space="preserve">, de nacionalidad __________, mayor de edad, titular de la cédula de identidad N.º ____________________, con domicilio en ________________________________, teléfono ____________________ y correo electrónico ____________________; quienes actúan conjuntamente bajo la denominación comercial </w:t>
+        <w:t xml:space="preserve">, mayor de edad, titular de la cédula de identidad N.º ____________________, con domicilio en ________________________________; quienes actúan conjuntamente bajo la denominación comercial </w:t>
       </w:r>
       <w:r>
         <w:rPr>
@@ -1048,7 +1206,7 @@
           <w:sz w:val="21"/>
           <w:szCs w:val="21"/>
         </w:rPr>
-        <w:t xml:space="preserve"> (entregables y plazos), el </w:t>
+        <w:t xml:space="preserve"> (entregables), el </w:t>
       </w:r>
       <w:r>
         <w:rPr>
@@ -1369,7 +1527,7 @@
           <w:sz w:val="21"/>
           <w:szCs w:val="21"/>
         </w:rPr>
-        <w:t xml:space="preserve"> plan de pre-lanzamiento y lista de espera, video de lanzamiento, piezas de la semana de lanzamiento y acciones de captación en eventos presenciales acordados.</w:t>
+        <w:t xml:space="preserve"> plan de pre-lanzamiento y lista de espera, video de lanzamiento, piezas de la semana de lanzamiento y las acciones de captación que las partes acuerden.</w:t>
       </w:r>
     </w:p>
     <w:p>
@@ -1982,59 +2140,47 @@
           <w:sz w:val="21"/>
           <w:szCs w:val="21"/>
         </w:rPr>
-        <w:t xml:space="preserve">Los entregables y sus fechas límite se detallan en el </w:t>
-      </w:r>
-      <w:r>
-        <w:rPr>
-          <w:rFonts w:ascii="Calibri" w:cs="Calibri" w:eastAsia="Calibri" w:hAnsi="Calibri"/>
-          <w:b/>
-          <w:bCs/>
-          <w:color w:val="1B1B1B"/>
-          <w:sz w:val="21"/>
-          <w:szCs w:val="21"/>
-        </w:rPr>
-        <w:t xml:space="preserve">Anexo A</w:t>
-      </w:r>
-      <w:r>
-        <w:rPr>
-          <w:rFonts w:ascii="Calibri" w:cs="Calibri" w:eastAsia="Calibri" w:hAnsi="Calibri"/>
-          <w:color w:val="1B1B1B"/>
-          <w:sz w:val="21"/>
-          <w:szCs w:val="21"/>
-        </w:rPr>
-        <w:t xml:space="preserve">. Las fechas que dependen de insumos de EL CLIENTE se rigen además por la cláusula décima tercera.</w:t>
-      </w:r>
-    </w:p>
-    <w:p>
-      <w:pPr>
-        <w:keepNext/>
-        <w:pBdr>
-          <w:bottom w:val="single" w:color="C7D9DD" w:sz="4" w:space="4"/>
-        </w:pBdr>
-        <w:spacing w:after="140" w:before="300"/>
-      </w:pPr>
-      <w:r>
-        <w:rPr>
-          <w:rFonts w:ascii="Calibri" w:cs="Calibri" w:eastAsia="Calibri" w:hAnsi="Calibri"/>
-          <w:b/>
-          <w:bCs/>
-          <w:color w:val="079CB5"/>
-          <w:spacing w:val="24"/>
-          <w:sz w:val="18"/>
-          <w:szCs w:val="18"/>
-        </w:rPr>
-        <w:t xml:space="preserve">CLÁUSULA SEXTA</w:t>
-      </w:r>
-      <w:r>
-        <w:rPr>
-          <w:rFonts w:ascii="Georgia" w:cs="Georgia" w:eastAsia="Georgia" w:hAnsi="Georgia"/>
-          <w:b/>
-          <w:bCs/>
-          <w:color w:val="1B1B1B"/>
-          <w:sz w:val="23"/>
-          <w:szCs w:val="23"/>
-        </w:rPr>
-        <w:t xml:space="preserve">   Honorarios</w:t>
+        <w:t xml:space="preserve">La </w:t>
+      </w:r>
+      <w:r>
+        <w:rPr>
+          <w:rFonts w:ascii="Calibri" w:cs="Calibri" w:eastAsia="Calibri" w:hAnsi="Calibri"/>
+          <w:b/>
+          <w:bCs/>
+          <w:color w:val="1B1B1B"/>
+          <w:sz w:val="21"/>
+          <w:szCs w:val="21"/>
+        </w:rPr>
+        <w:t xml:space="preserve">publicación de contenido</w:t>
+      </w:r>
+      <w:r>
+        <w:rPr>
+          <w:rFonts w:ascii="Calibri" w:cs="Calibri" w:eastAsia="Calibri" w:hAnsi="Calibri"/>
+          <w:color w:val="1B1B1B"/>
+          <w:sz w:val="21"/>
+          <w:szCs w:val="21"/>
+        </w:rPr>
+        <w:t xml:space="preserve"> en los canales de la marca comienza el </w:t>
+      </w:r>
+      <w:r>
+        <w:rPr>
+          <w:rFonts w:ascii="Calibri" w:cs="Calibri" w:eastAsia="Calibri" w:hAnsi="Calibri"/>
+          <w:b/>
+          <w:bCs/>
+          <w:color w:val="1B1B1B"/>
+          <w:sz w:val="21"/>
+          <w:szCs w:val="21"/>
+        </w:rPr>
+        <w:t xml:space="preserve">9 de octubre de 2026</w:t>
+      </w:r>
+      <w:r>
+        <w:rPr>
+          <w:rFonts w:ascii="Calibri" w:cs="Calibri" w:eastAsia="Calibri" w:hAnsi="Calibri"/>
+          <w:color w:val="1B1B1B"/>
+          <w:sz w:val="21"/>
+          <w:szCs w:val="21"/>
+        </w:rPr>
+        <w:t xml:space="preserve">. Desde esa fecha se presta la gestión mensual de contenido descrita en la cláusula 3.5.</w:t>
       </w:r>
     </w:p>
     <w:p>
@@ -2055,6 +2201,88 @@
           <w:sz w:val="21"/>
           <w:szCs w:val="21"/>
         </w:rPr>
+        <w:t xml:space="preserve">5.4	</w:t>
+      </w:r>
+      <w:r>
+        <w:rPr>
+          <w:rFonts w:ascii="Calibri" w:cs="Calibri" w:eastAsia="Calibri" w:hAnsi="Calibri"/>
+          <w:color w:val="1B1B1B"/>
+          <w:sz w:val="21"/>
+          <w:szCs w:val="21"/>
+        </w:rPr>
+        <w:t xml:space="preserve">Los entregables y su periodicidad se detallan en el </w:t>
+      </w:r>
+      <w:r>
+        <w:rPr>
+          <w:rFonts w:ascii="Calibri" w:cs="Calibri" w:eastAsia="Calibri" w:hAnsi="Calibri"/>
+          <w:b/>
+          <w:bCs/>
+          <w:color w:val="1B1B1B"/>
+          <w:sz w:val="21"/>
+          <w:szCs w:val="21"/>
+        </w:rPr>
+        <w:t xml:space="preserve">Anexo A</w:t>
+      </w:r>
+      <w:r>
+        <w:rPr>
+          <w:rFonts w:ascii="Calibri" w:cs="Calibri" w:eastAsia="Calibri" w:hAnsi="Calibri"/>
+          <w:color w:val="1B1B1B"/>
+          <w:sz w:val="21"/>
+          <w:szCs w:val="21"/>
+        </w:rPr>
+        <w:t xml:space="preserve">. Los plazos que dependen de insumos de EL CLIENTE se rigen además por la cláusula décima tercera.</w:t>
+      </w:r>
+    </w:p>
+    <w:p>
+      <w:pPr>
+        <w:keepNext/>
+        <w:pBdr>
+          <w:bottom w:val="single" w:color="C7D9DD" w:sz="4" w:space="4"/>
+        </w:pBdr>
+        <w:spacing w:after="140" w:before="300"/>
+      </w:pPr>
+      <w:r>
+        <w:rPr>
+          <w:rFonts w:ascii="Calibri" w:cs="Calibri" w:eastAsia="Calibri" w:hAnsi="Calibri"/>
+          <w:b/>
+          <w:bCs/>
+          <w:color w:val="079CB5"/>
+          <w:spacing w:val="24"/>
+          <w:sz w:val="18"/>
+          <w:szCs w:val="18"/>
+        </w:rPr>
+        <w:t xml:space="preserve">CLÁUSULA SEXTA</w:t>
+      </w:r>
+      <w:r>
+        <w:rPr>
+          <w:rFonts w:ascii="Georgia" w:cs="Georgia" w:eastAsia="Georgia" w:hAnsi="Georgia"/>
+          <w:b/>
+          <w:bCs/>
+          <w:color w:val="1B1B1B"/>
+          <w:sz w:val="23"/>
+          <w:szCs w:val="23"/>
+        </w:rPr>
+        <w:t xml:space="preserve">   Honorarios</w:t>
+      </w:r>
+    </w:p>
+    <w:p>
+      <w:pPr>
+        <w:tabs>
+          <w:tab w:val="left" w:pos="600"/>
+        </w:tabs>
+        <w:spacing w:after="110" w:line="300"/>
+        <w:ind w:left="600" w:hanging="600"/>
+        <w:jc w:val="both"/>
+      </w:pPr>
+      <w:r>
+        <w:rPr>
+          <w:rFonts w:ascii="Calibri" w:cs="Calibri" w:eastAsia="Calibri" w:hAnsi="Calibri"/>
+          <w:b/>
+          <w:bCs/>
+          <w:color w:val="00677E"/>
+          <w:sz w:val="21"/>
+          <w:szCs w:val="21"/>
+        </w:rPr>
         <w:t xml:space="preserve">6.1	</w:t>
       </w:r>
       <w:r>
@@ -3182,27 +3410,47 @@
           <w:sz w:val="21"/>
           <w:szCs w:val="21"/>
         </w:rPr>
-        <w:t xml:space="preserve">Garantizar que su contacto técnico, </w:t>
-      </w:r>
-      <w:r>
-        <w:rPr>
-          <w:rFonts w:ascii="Calibri" w:cs="Calibri" w:eastAsia="Calibri" w:hAnsi="Calibri"/>
-          <w:b/>
-          <w:bCs/>
-          <w:color w:val="1B1B1B"/>
-          <w:sz w:val="21"/>
-          <w:szCs w:val="21"/>
-        </w:rPr>
-        <w:t xml:space="preserve">Kurt</w:t>
-      </w:r>
-      <w:r>
-        <w:rPr>
-          <w:rFonts w:ascii="Calibri" w:cs="Calibri" w:eastAsia="Calibri" w:hAnsi="Calibri"/>
-          <w:color w:val="1B1B1B"/>
-          <w:sz w:val="21"/>
-          <w:szCs w:val="21"/>
-        </w:rPr>
-        <w:t xml:space="preserve">, responda las consultas técnicas que condicionen el contenido —entre ellas, la fecha exacta de lanzamiento, la existencia y duración de la prueba gratuita, los métodos de pago disponibles para el usuario venezolano y el funcionamiento del plan tras una sesión no realizada— en los plazos del Anexo A.</w:t>
+        <w:t xml:space="preserve">Garantizar que su representante autorizado, </w:t>
+      </w:r>
+      <w:r>
+        <w:rPr>
+          <w:rFonts w:ascii="Calibri" w:cs="Calibri" w:eastAsia="Calibri" w:hAnsi="Calibri"/>
+          <w:b/>
+          <w:bCs/>
+          <w:color w:val="1B1B1B"/>
+          <w:sz w:val="21"/>
+          <w:szCs w:val="21"/>
+        </w:rPr>
+        <w:t xml:space="preserve">Kurt A. Libre C.</w:t>
+      </w:r>
+      <w:r>
+        <w:rPr>
+          <w:rFonts w:ascii="Calibri" w:cs="Calibri" w:eastAsia="Calibri" w:hAnsi="Calibri"/>
+          <w:color w:val="1B1B1B"/>
+          <w:sz w:val="21"/>
+          <w:szCs w:val="21"/>
+        </w:rPr>
+        <w:t xml:space="preserve">, responda las consultas técnicas que condicionen el contenido —entre ellas, la fecha exacta de lanzamiento, la existencia y duración de la prueba gratuita, los métodos de pago disponibles para el usuario venezolano y el funcionamiento del plan tras una sesión no realizada— en un plazo máximo de </w:t>
+      </w:r>
+      <w:r>
+        <w:rPr>
+          <w:rFonts w:ascii="Calibri" w:cs="Calibri" w:eastAsia="Calibri" w:hAnsi="Calibri"/>
+          <w:b/>
+          <w:bCs/>
+          <w:color w:val="1B1B1B"/>
+          <w:sz w:val="21"/>
+          <w:szCs w:val="21"/>
+        </w:rPr>
+        <w:t xml:space="preserve">cinco (5) días hábiles</w:t>
+      </w:r>
+      <w:r>
+        <w:rPr>
+          <w:rFonts w:ascii="Calibri" w:cs="Calibri" w:eastAsia="Calibri" w:hAnsi="Calibri"/>
+          <w:color w:val="1B1B1B"/>
+          <w:sz w:val="21"/>
+          <w:szCs w:val="21"/>
+        </w:rPr>
+        <w:t xml:space="preserve"> desde que LA AGENCIA las solicite por escrito.</w:t>
       </w:r>
     </w:p>
     <w:p>
@@ -3506,7 +3754,7 @@
           <w:sz w:val="21"/>
           <w:szCs w:val="21"/>
         </w:rPr>
-        <w:t xml:space="preserve">Cuando un entregable de LA AGENCIA dependa de un insumo, una aprobación o una respuesta de EL CLIENTE o de su contacto técnico, y estos lleguen después de la fecha prevista en el Anexo A, </w:t>
+        <w:t xml:space="preserve">Cuando un entregable de LA AGENCIA dependa de un insumo, una aprobación o una respuesta de EL CLIENTE o de su contacto técnico, y estos lleguen fuera del plazo de la cláusula 11.4 o del que las partes hayan acordado, </w:t>
       </w:r>
       <w:r>
         <w:rPr>
@@ -4022,7 +4270,7 @@
           <w:sz w:val="21"/>
           <w:szCs w:val="21"/>
         </w:rPr>
-        <w:t xml:space="preserve">EL CLIENTE autoriza el uso de su nombre, imagen y voz en las piezas de comunicación de Kenia producidas bajo este contrato, durante su vigencia y mientras esas piezas permanezcan publicadas en los canales de la marca.</w:t>
+        <w:t xml:space="preserve">EL CLIENTE autoriza, y su representante legal consiente a título personal, el uso del nombre, la imagen y la voz de este último en las piezas de comunicación de Kenia producidas bajo este contrato, durante su vigencia y mientras esas piezas permanezcan publicadas en los canales de la marca.</w:t>
       </w:r>
     </w:p>
     <w:p>
@@ -4326,7 +4574,7 @@
           <w:sz w:val="21"/>
           <w:szCs w:val="21"/>
         </w:rPr>
-        <w:t xml:space="preserve"> y deben estar registrados a su nombre.</w:t>
+        <w:t xml:space="preserve"> y deben estar registrados a su nombre o al de su representante legal.</w:t>
       </w:r>
     </w:p>
     <w:p>
@@ -4418,38 +4666,38 @@
           <w:sz w:val="21"/>
           <w:szCs w:val="21"/>
         </w:rPr>
-        <w:t xml:space="preserve">Los interlocutores del proyecto son: por EL CLIENTE, </w:t>
-      </w:r>
-      <w:r>
-        <w:rPr>
-          <w:rFonts w:ascii="Calibri" w:cs="Calibri" w:eastAsia="Calibri" w:hAnsi="Calibri"/>
-          <w:b/>
-          <w:bCs/>
-          <w:color w:val="1B1B1B"/>
-          <w:sz w:val="21"/>
-          <w:szCs w:val="21"/>
-        </w:rPr>
-        <w:t xml:space="preserve">Ninro Libre</w:t>
-      </w:r>
-      <w:r>
-        <w:rPr>
-          <w:rFonts w:ascii="Calibri" w:cs="Calibri" w:eastAsia="Calibri" w:hAnsi="Calibri"/>
-          <w:color w:val="1B1B1B"/>
-          <w:sz w:val="21"/>
-          <w:szCs w:val="21"/>
-        </w:rPr>
-        <w:t xml:space="preserve">; como contacto técnico, </w:t>
-      </w:r>
-      <w:r>
-        <w:rPr>
-          <w:rFonts w:ascii="Calibri" w:cs="Calibri" w:eastAsia="Calibri" w:hAnsi="Calibri"/>
-          <w:b/>
-          <w:bCs/>
-          <w:color w:val="1B1B1B"/>
-          <w:sz w:val="21"/>
-          <w:szCs w:val="21"/>
-        </w:rPr>
-        <w:t xml:space="preserve">Kurt</w:t>
+        <w:t xml:space="preserve">Los interlocutores del proyecto son: por EL CLIENTE, su representante legal, </w:t>
+      </w:r>
+      <w:r>
+        <w:rPr>
+          <w:rFonts w:ascii="Calibri" w:cs="Calibri" w:eastAsia="Calibri" w:hAnsi="Calibri"/>
+          <w:b/>
+          <w:bCs/>
+          <w:color w:val="1B1B1B"/>
+          <w:sz w:val="21"/>
+          <w:szCs w:val="21"/>
+        </w:rPr>
+        <w:t xml:space="preserve">Ninro Alexander Libre Guerrero</w:t>
+      </w:r>
+      <w:r>
+        <w:rPr>
+          <w:rFonts w:ascii="Calibri" w:cs="Calibri" w:eastAsia="Calibri" w:hAnsi="Calibri"/>
+          <w:color w:val="1B1B1B"/>
+          <w:sz w:val="21"/>
+          <w:szCs w:val="21"/>
+        </w:rPr>
+        <w:t xml:space="preserve">, y su representante autorizado y contacto técnico, </w:t>
+      </w:r>
+      <w:r>
+        <w:rPr>
+          <w:rFonts w:ascii="Calibri" w:cs="Calibri" w:eastAsia="Calibri" w:hAnsi="Calibri"/>
+          <w:b/>
+          <w:bCs/>
+          <w:color w:val="1B1B1B"/>
+          <w:sz w:val="21"/>
+          <w:szCs w:val="21"/>
+        </w:rPr>
+        <w:t xml:space="preserve">Kurt A. Libre C.</w:t>
       </w:r>
       <w:r>
         <w:rPr>
@@ -5080,7 +5328,7 @@
           <w:sz w:val="21"/>
           <w:szCs w:val="21"/>
         </w:rPr>
-        <w:t xml:space="preserve">Este contrato se rige por las leyes de la República Bolivariana de Venezuela.</w:t>
+        <w:t xml:space="preserve">Este contrato se rige por las leyes de la República Bolivariana de Venezuela, lugar donde se prestan los servicios y donde tienen su domicilio los representantes de ambas partes.</w:t>
       </w:r>
     </w:p>
     <w:p>
@@ -5180,7 +5428,7 @@
           <w:sz w:val="21"/>
           <w:szCs w:val="21"/>
         </w:rPr>
-        <w:t xml:space="preserve">Se hacen tres (3) ejemplares de un mismo tenor y a un solo efecto, uno para cada firmante, en la ciudad de </w:t>
+        <w:t xml:space="preserve">Se hacen dos (2) ejemplares de un mismo tenor y a un solo efecto, uno para cada parte, en la ciudad de </w:t>
       </w:r>
       <w:r>
         <w:rPr>
@@ -5280,7 +5528,7 @@
                 <w:sz w:val="21"/>
                 <w:szCs w:val="21"/>
               </w:rPr>
-              <w:t xml:space="preserve">Ninro Libre</w:t>
+              <w:t xml:space="preserve">Ninro Alexander Libre Guerrero</w:t>
             </w:r>
           </w:p>
           <w:p>
@@ -5311,7 +5559,7 @@
                 <w:sz w:val="16"/>
                 <w:szCs w:val="16"/>
               </w:rPr>
-              <w:t xml:space="preserve">EL CLIENTE</w:t>
+              <w:t xml:space="preserve">EL CLIENTE · REPRESENTANTE LEGAL</w:t>
             </w:r>
           </w:p>
         </w:tc>
@@ -5401,11 +5649,67 @@
               <w:bottom w:val="none" w:color="FFFFFF" w:sz="0"/>
               <w:right w:val="none" w:color="FFFFFF" w:sz="0"/>
             </w:tcBorders>
-          </w:tcPr>
+            <w:tcMar>
+              <w:top w:type="dxa" w:w="0"/>
+              <w:left w:type="dxa" w:w="200"/>
+              <w:bottom w:type="dxa" w:w="0"/>
+              <w:right w:type="dxa" w:w="200"/>
+            </w:tcMar>
+          </w:tcPr>
+          <w:p>
+            <w:pPr>
+              <w:spacing w:after="900"/>
+            </w:pPr>
+          </w:p>
+          <w:p>
+            <w:pPr>
+              <w:pBdr>
+                <w:top w:val="single" w:color="1B1B1B" w:sz="6" w:space="6"/>
+              </w:pBdr>
+              <w:spacing w:after="40"/>
+            </w:pPr>
+            <w:r>
+              <w:rPr>
+                <w:rFonts w:ascii="Calibri" w:cs="Calibri" w:eastAsia="Calibri" w:hAnsi="Calibri"/>
+                <w:b/>
+                <w:bCs/>
+                <w:color w:val="1B1B1B"/>
+                <w:sz w:val="21"/>
+                <w:szCs w:val="21"/>
+              </w:rPr>
+              <w:t xml:space="preserve">Kurt A. Libre C.</w:t>
+            </w:r>
+          </w:p>
+          <w:p>
+            <w:pPr>
+              <w:spacing w:after="30"/>
+            </w:pPr>
+            <w:r>
+              <w:rPr>
+                <w:rFonts w:ascii="Calibri" w:cs="Calibri" w:eastAsia="Calibri" w:hAnsi="Calibri"/>
+                <w:color w:val="3C3C3C"/>
+                <w:sz w:val="19"/>
+                <w:szCs w:val="19"/>
+              </w:rPr>
+              <w:t xml:space="preserve">C.I. N.º ____________________</w:t>
+            </w:r>
+          </w:p>
           <w:p>
             <w:pPr>
               <w:spacing w:after="0"/>
             </w:pPr>
+            <w:r>
+              <w:rPr>
+                <w:rFonts w:ascii="Calibri" w:cs="Calibri" w:eastAsia="Calibri" w:hAnsi="Calibri"/>
+                <w:b/>
+                <w:bCs/>
+                <w:color w:val="079CB5"/>
+                <w:spacing w:val="20"/>
+                <w:sz w:val="16"/>
+                <w:szCs w:val="16"/>
+              </w:rPr>
+              <w:t xml:space="preserve">EL CLIENTE · REPRESENTANTE AUTORIZADO</w:t>
+            </w:r>
           </w:p>
         </w:tc>
         <w:tc>
@@ -5483,6 +5787,46 @@
       </w:tr>
     </w:tbl>
     <w:p>
+      <w:pPr>
+        <w:spacing w:after="120"/>
+      </w:pPr>
+    </w:p>
+    <w:p>
+      <w:pPr>
+        <w:spacing w:after="140" w:line="300"/>
+        <w:jc w:val="both"/>
+      </w:pPr>
+      <w:r>
+        <w:rPr>
+          <w:rFonts w:ascii="Calibri" w:cs="Calibri" w:eastAsia="Calibri" w:hAnsi="Calibri"/>
+          <w:color w:val="3C3C3C"/>
+          <w:sz w:val="19"/>
+          <w:szCs w:val="19"/>
+        </w:rPr>
+        <w:t xml:space="preserve">Ninro Alexander Libre Guerrero y Kurt A. Libre C. suscriben en nombre y representación de </w:t>
+      </w:r>
+      <w:r>
+        <w:rPr>
+          <w:rFonts w:ascii="Calibri" w:cs="Calibri" w:eastAsia="Calibri" w:hAnsi="Calibri"/>
+          <w:b/>
+          <w:bCs/>
+          <w:color w:val="3C3C3C"/>
+          <w:sz w:val="19"/>
+          <w:szCs w:val="19"/>
+        </w:rPr>
+        <w:t xml:space="preserve">LIBRE G PLATFORMS LLC</w:t>
+      </w:r>
+      <w:r>
+        <w:rPr>
+          <w:rFonts w:ascii="Calibri" w:cs="Calibri" w:eastAsia="Calibri" w:hAnsi="Calibri"/>
+          <w:color w:val="3C3C3C"/>
+          <w:sz w:val="19"/>
+          <w:szCs w:val="19"/>
+        </w:rPr>
+        <w:t xml:space="preserve">.</w:t>
+      </w:r>
+    </w:p>
+    <w:p>
       <w:r>
         <w:br w:type="page"/>
       </w:r>
@@ -5503,7 +5847,7 @@
           <w:sz w:val="30"/>
           <w:szCs w:val="30"/>
         </w:rPr>
-        <w:t xml:space="preserve">Anexo A · Entregables y plazos</w:t>
+        <w:t xml:space="preserve">Anexo A · Entregables</w:t>
       </w:r>
     </w:p>
     <w:p>
@@ -5517,7 +5861,7 @@
           <w:sz w:val="19"/>
           <w:szCs w:val="19"/>
         </w:rPr>
-        <w:t xml:space="preserve">Estado a la fecha de firma. Las fechas de LA AGENCIA que dependen de insumos de EL CLIENTE se desplazan conforme a la cláusula décima tercera.</w:t>
+        <w:t xml:space="preserve">Qué entrega LA AGENCIA, en qué forma y con qué periodicidad. Los plazos que dependen de insumos de EL CLIENTE se rigen por la cláusula décima tercera.</w:t>
       </w:r>
     </w:p>
     <w:p>
@@ -5533,7 +5877,22 @@
           <w:sz w:val="24"/>
           <w:szCs w:val="24"/>
         </w:rPr>
-        <w:t xml:space="preserve">A.1  Entregados por LA AGENCIA</w:t>
+        <w:t xml:space="preserve">A.1  Fase estratégica — entregada</w:t>
+      </w:r>
+    </w:p>
+    <w:p>
+      <w:pPr>
+        <w:spacing w:after="140" w:line="300"/>
+        <w:jc w:val="both"/>
+      </w:pPr>
+      <w:r>
+        <w:rPr>
+          <w:rFonts w:ascii="Calibri" w:cs="Calibri" w:eastAsia="Calibri" w:hAnsi="Calibri"/>
+          <w:color w:val="1B1B1B"/>
+          <w:sz w:val="21"/>
+          <w:szCs w:val="21"/>
+        </w:rPr>
+        <w:t xml:space="preserve">EL CLIENTE declara haber recibido los siguientes entregables, que forman parte de los servicios pagados con la mensualidad de septiembre de 2026:</w:t>
       </w:r>
     </w:p>
     <w:tbl>
@@ -5640,7 +5999,7 @@
                 <w:sz w:val="16"/>
                 <w:szCs w:val="16"/>
               </w:rPr>
-              <w:t xml:space="preserve">ENTREGADO</w:t>
+              <w:t xml:space="preserve">FECHA</w:t>
             </w:r>
           </w:p>
         </w:tc>
@@ -5697,7 +6056,7 @@
                 <w:sz w:val="19"/>
                 <w:szCs w:val="19"/>
               </w:rPr>
-              <w:t xml:space="preserve">Doce bloques: núcleo estratégico, target, cinco buyer personas, beneficios, arquetipo y tono, brief de moodboard, naming y descriptor. Documento de Word para EL CLIENTE</w:t>
+              <w:t xml:space="preserve">Núcleo estratégico, público objetivo, cinco buyer personas, beneficios, arquetipo, personalidad y tono, brief de moodboard, naming y descriptor</w:t>
             </w:r>
           </w:p>
         </w:tc>
@@ -5754,7 +6113,7 @@
                 <w:sz w:val="19"/>
                 <w:szCs w:val="19"/>
               </w:rPr>
-              <w:t xml:space="preserve">Análisis de marketing — PESTEL</w:t>
+              <w:t xml:space="preserve">Análisis de entorno (PESTEL)</w:t>
             </w:r>
           </w:p>
         </w:tc>
@@ -5780,7 +6139,7 @@
                 <w:sz w:val="19"/>
                 <w:szCs w:val="19"/>
               </w:rPr>
-              <w:t xml:space="preserve">Entorno político, económico, social, tecnológico, ecológico y legal, con fuentes</w:t>
+              <w:t xml:space="preserve">Factores políticos, económicos, sociales, tecnológicos, ecológicos y legales, con fuentes</w:t>
             </w:r>
           </w:p>
         </w:tc>
@@ -5837,7 +6196,7 @@
                 <w:sz w:val="19"/>
                 <w:szCs w:val="19"/>
               </w:rPr>
-              <w:t xml:space="preserve">Estrategia de contenido v1.1</w:t>
+              <w:t xml:space="preserve">Estrategia de contenido</w:t>
             </w:r>
           </w:p>
         </w:tc>
@@ -5863,7 +6222,7 @@
                 <w:sz w:val="19"/>
                 <w:szCs w:val="19"/>
               </w:rPr>
-              <w:t xml:space="preserve">Embudo, pilares, formatos, canales, calendario del mes 1, plan de lanzamiento, tagline y frases propuestos, relato de marca y métricas</w:t>
+              <w:t xml:space="preserve">Embudo, pilares, formatos, canales, calendario, plan de lanzamiento, propuestas de tagline y frases, y relato de marca</w:t>
             </w:r>
           </w:p>
         </w:tc>
@@ -5920,7 +6279,7 @@
                 <w:sz w:val="19"/>
                 <w:szCs w:val="19"/>
               </w:rPr>
-              <w:t xml:space="preserve">Guion de la grabación del 13 de septiembre</w:t>
+              <w:t xml:space="preserve">Guion de grabación</w:t>
             </w:r>
           </w:p>
         </w:tc>
@@ -5946,7 +6305,7 @@
                 <w:sz w:val="19"/>
                 <w:szCs w:val="19"/>
               </w:rPr>
-              <w:t xml:space="preserve">Guion y shot list de la única ventana de grabación con EL CLIENTE</w:t>
+              <w:t xml:space="preserve">Guion y lista de tomas de la grabación del 13 de septiembre de 2026</w:t>
             </w:r>
           </w:p>
         </w:tc>
@@ -5985,7 +6344,7 @@
     </w:p>
     <w:p>
       <w:pPr>
-        <w:spacing w:after="120"/>
+        <w:spacing w:after="120" w:before="60"/>
       </w:pPr>
       <w:r>
         <w:rPr>
@@ -5996,7 +6355,7 @@
           <w:sz w:val="24"/>
           <w:szCs w:val="24"/>
         </w:rPr>
-        <w:t xml:space="preserve">A.2  Pendientes de LA AGENCIA</w:t>
+        <w:t xml:space="preserve">A.2  Fase estratégica — por completar</w:t>
       </w:r>
     </w:p>
     <w:tbl>
@@ -6012,9 +6371,8 @@
         </w:tblBorders>
       </w:tblPr>
       <w:tblGrid>
-        <w:gridCol w:w="5048"/>
-        <w:gridCol w:w="2300"/>
-        <w:gridCol w:w="2300"/>
+        <w:gridCol w:w="6648"/>
+        <w:gridCol w:w="3000"/>
       </w:tblGrid>
       <w:tr>
         <w:trPr>
@@ -6022,7 +6380,7 @@
         </w:trPr>
         <w:tc>
           <w:tcPr>
-            <w:tcW w:type="dxa" w:w="5048"/>
+            <w:tcW w:type="dxa" w:w="6648"/>
             <w:shd w:fill="00677E" w:color="auto" w:val="clear"/>
             <w:tcMar>
               <w:top w:type="dxa" w:w="100"/>
@@ -6051,7 +6409,7 @@
         </w:tc>
         <w:tc>
           <w:tcPr>
-            <w:tcW w:type="dxa" w:w="2300"/>
+            <w:tcW w:type="dxa" w:w="3000"/>
             <w:shd w:fill="00677E" w:color="auto" w:val="clear"/>
             <w:tcMar>
               <w:top w:type="dxa" w:w="100"/>
@@ -6074,36 +6432,7 @@
                 <w:sz w:val="16"/>
                 <w:szCs w:val="16"/>
               </w:rPr>
-              <w:t xml:space="preserve">FECHA LÍMITE</w:t>
-            </w:r>
-          </w:p>
-        </w:tc>
-        <w:tc>
-          <w:tcPr>
-            <w:tcW w:type="dxa" w:w="2300"/>
-            <w:shd w:fill="00677E" w:color="auto" w:val="clear"/>
-            <w:tcMar>
-              <w:top w:type="dxa" w:w="100"/>
-              <w:left w:type="dxa" w:w="140"/>
-              <w:bottom w:type="dxa" w:w="100"/>
-              <w:right w:type="dxa" w:w="140"/>
-            </w:tcMar>
-          </w:tcPr>
-          <w:p>
-            <w:pPr>
-              <w:spacing w:after="0"/>
-            </w:pPr>
-            <w:r>
-              <w:rPr>
-                <w:rFonts w:ascii="Calibri" w:cs="Calibri" w:eastAsia="Calibri" w:hAnsi="Calibri"/>
-                <w:b/>
-                <w:bCs/>
-                <w:color w:val="FFFFFF"/>
-                <w:spacing w:val="20"/>
-                <w:sz w:val="16"/>
-                <w:szCs w:val="16"/>
-              </w:rPr>
-              <w:t xml:space="preserve">DEPENDE DE</w:t>
+              <w:t xml:space="preserve">PLAZO</w:t>
             </w:r>
           </w:p>
         </w:tc>
@@ -6114,7 +6443,7 @@
         </w:trPr>
         <w:tc>
           <w:tcPr>
-            <w:tcW w:type="dxa" w:w="5048"/>
+            <w:tcW w:type="dxa" w:w="6648"/>
             <w:shd w:fill="FFFFFF" w:color="auto" w:val="clear"/>
             <w:tcMar>
               <w:top w:type="dxa" w:w="100"/>
@@ -6134,13 +6463,13 @@
                 <w:sz w:val="19"/>
                 <w:szCs w:val="19"/>
               </w:rPr>
-              <w:t xml:space="preserve">Acción de captación en la carrera Caracas Rock</w:t>
-            </w:r>
-          </w:p>
-        </w:tc>
-        <w:tc>
-          <w:tcPr>
-            <w:tcW w:type="dxa" w:w="2300"/>
+              <w:t xml:space="preserve">Análisis de marketing complementario: tendencias, análisis del servicio, socios estratégicos, pricing, benchmark, matriz FODA y objetivos SMART</w:t>
+            </w:r>
+          </w:p>
+        </w:tc>
+        <w:tc>
+          <w:tcPr>
+            <w:tcW w:type="dxa" w:w="3000"/>
             <w:shd w:fill="FFFFFF" w:color="auto" w:val="clear"/>
             <w:tcMar>
               <w:top w:type="dxa" w:w="100"/>
@@ -6160,33 +6489,7 @@
                 <w:sz w:val="19"/>
                 <w:szCs w:val="19"/>
               </w:rPr>
-              <w:t xml:space="preserve">4 oct 2026</w:t>
-            </w:r>
-          </w:p>
-        </w:tc>
-        <w:tc>
-          <w:tcPr>
-            <w:tcW w:type="dxa" w:w="2300"/>
-            <w:shd w:fill="FFFFFF" w:color="auto" w:val="clear"/>
-            <w:tcMar>
-              <w:top w:type="dxa" w:w="100"/>
-              <w:left w:type="dxa" w:w="140"/>
-              <w:bottom w:type="dxa" w:w="100"/>
-              <w:right w:type="dxa" w:w="140"/>
-            </w:tcMar>
-          </w:tcPr>
-          <w:p>
-            <w:pPr>
-              <w:spacing w:after="0" w:line="264"/>
-            </w:pPr>
-            <w:r>
-              <w:rPr>
-                <w:rFonts w:ascii="Calibri" w:cs="Calibri" w:eastAsia="Calibri" w:hAnsi="Calibri"/>
-                <w:color w:val="1B1B1B"/>
-                <w:sz w:val="19"/>
-                <w:szCs w:val="19"/>
-              </w:rPr>
-              <w:t xml:space="preserve">—</w:t>
+              <w:t xml:space="preserve">Hasta el 31 de octubre de 2026</w:t>
             </w:r>
           </w:p>
         </w:tc>
@@ -6197,7 +6500,7 @@
         </w:trPr>
         <w:tc>
           <w:tcPr>
-            <w:tcW w:type="dxa" w:w="5048"/>
+            <w:tcW w:type="dxa" w:w="6648"/>
             <w:shd w:fill="F2F6F7" w:color="auto" w:val="clear"/>
             <w:tcMar>
               <w:top w:type="dxa" w:w="100"/>
@@ -6217,13 +6520,13 @@
                 <w:sz w:val="19"/>
                 <w:szCs w:val="19"/>
               </w:rPr>
-              <w:t xml:space="preserve">Moodboard con los siete territorios visuales</w:t>
-            </w:r>
-          </w:p>
-        </w:tc>
-        <w:tc>
-          <w:tcPr>
-            <w:tcW w:type="dxa" w:w="2300"/>
+              <w:t xml:space="preserve">Moodboard de la marca</w:t>
+            </w:r>
+          </w:p>
+        </w:tc>
+        <w:tc>
+          <w:tcPr>
+            <w:tcW w:type="dxa" w:w="3000"/>
             <w:shd w:fill="F2F6F7" w:color="auto" w:val="clear"/>
             <w:tcMar>
               <w:top w:type="dxa" w:w="100"/>
@@ -6243,780 +6546,7 @@
                 <w:sz w:val="19"/>
                 <w:szCs w:val="19"/>
               </w:rPr>
-              <w:t xml:space="preserve">9 oct 2026</w:t>
-            </w:r>
-          </w:p>
-        </w:tc>
-        <w:tc>
-          <w:tcPr>
-            <w:tcW w:type="dxa" w:w="2300"/>
-            <w:shd w:fill="F2F6F7" w:color="auto" w:val="clear"/>
-            <w:tcMar>
-              <w:top w:type="dxa" w:w="100"/>
-              <w:left w:type="dxa" w:w="140"/>
-              <w:bottom w:type="dxa" w:w="100"/>
-              <w:right w:type="dxa" w:w="140"/>
-            </w:tcMar>
-          </w:tcPr>
-          <w:p>
-            <w:pPr>
-              <w:spacing w:after="0" w:line="264"/>
-            </w:pPr>
-            <w:r>
-              <w:rPr>
-                <w:rFonts w:ascii="Calibri" w:cs="Calibri" w:eastAsia="Calibri" w:hAnsi="Calibri"/>
-                <w:color w:val="1B1B1B"/>
-                <w:sz w:val="19"/>
-                <w:szCs w:val="19"/>
-              </w:rPr>
-              <w:t xml:space="preserve">—</w:t>
-            </w:r>
-          </w:p>
-        </w:tc>
-      </w:tr>
-      <w:tr>
-        <w:trPr>
-          <w:cantSplit/>
-        </w:trPr>
-        <w:tc>
-          <w:tcPr>
-            <w:tcW w:type="dxa" w:w="5048"/>
-            <w:shd w:fill="FFFFFF" w:color="auto" w:val="clear"/>
-            <w:tcMar>
-              <w:top w:type="dxa" w:w="100"/>
-              <w:left w:type="dxa" w:w="140"/>
-              <w:bottom w:type="dxa" w:w="100"/>
-              <w:right w:type="dxa" w:w="140"/>
-            </w:tcMar>
-          </w:tcPr>
-          <w:p>
-            <w:pPr>
-              <w:spacing w:after="0" w:line="264"/>
-            </w:pPr>
-            <w:r>
-              <w:rPr>
-                <w:rFonts w:ascii="Calibri" w:cs="Calibri" w:eastAsia="Calibri" w:hAnsi="Calibri"/>
-                <w:color w:val="1B1B1B"/>
-                <w:sz w:val="19"/>
-                <w:szCs w:val="19"/>
-              </w:rPr>
-              <w:t xml:space="preserve">Análisis de marketing — tendencias, pricing y benchmark formal</w:t>
-            </w:r>
-          </w:p>
-        </w:tc>
-        <w:tc>
-          <w:tcPr>
-            <w:tcW w:type="dxa" w:w="2300"/>
-            <w:shd w:fill="FFFFFF" w:color="auto" w:val="clear"/>
-            <w:tcMar>
-              <w:top w:type="dxa" w:w="100"/>
-              <w:left w:type="dxa" w:w="140"/>
-              <w:bottom w:type="dxa" w:w="100"/>
-              <w:right w:type="dxa" w:w="140"/>
-            </w:tcMar>
-          </w:tcPr>
-          <w:p>
-            <w:pPr>
-              <w:spacing w:after="0" w:line="264"/>
-            </w:pPr>
-            <w:r>
-              <w:rPr>
-                <w:rFonts w:ascii="Calibri" w:cs="Calibri" w:eastAsia="Calibri" w:hAnsi="Calibri"/>
-                <w:color w:val="1B1B1B"/>
-                <w:sz w:val="19"/>
-                <w:szCs w:val="19"/>
-              </w:rPr>
-              <w:t xml:space="preserve">9 oct 2026</w:t>
-            </w:r>
-          </w:p>
-        </w:tc>
-        <w:tc>
-          <w:tcPr>
-            <w:tcW w:type="dxa" w:w="2300"/>
-            <w:shd w:fill="FFFFFF" w:color="auto" w:val="clear"/>
-            <w:tcMar>
-              <w:top w:type="dxa" w:w="100"/>
-              <w:left w:type="dxa" w:w="140"/>
-              <w:bottom w:type="dxa" w:w="100"/>
-              <w:right w:type="dxa" w:w="140"/>
-            </w:tcMar>
-          </w:tcPr>
-          <w:p>
-            <w:pPr>
-              <w:spacing w:after="0" w:line="264"/>
-            </w:pPr>
-            <w:r>
-              <w:rPr>
-                <w:rFonts w:ascii="Calibri" w:cs="Calibri" w:eastAsia="Calibri" w:hAnsi="Calibri"/>
-                <w:color w:val="1B1B1B"/>
-                <w:sz w:val="19"/>
-                <w:szCs w:val="19"/>
-              </w:rPr>
-              <w:t xml:space="preserve">—</w:t>
-            </w:r>
-          </w:p>
-        </w:tc>
-      </w:tr>
-      <w:tr>
-        <w:trPr>
-          <w:cantSplit/>
-        </w:trPr>
-        <w:tc>
-          <w:tcPr>
-            <w:tcW w:type="dxa" w:w="5048"/>
-            <w:shd w:fill="F2F6F7" w:color="auto" w:val="clear"/>
-            <w:tcMar>
-              <w:top w:type="dxa" w:w="100"/>
-              <w:left w:type="dxa" w:w="140"/>
-              <w:bottom w:type="dxa" w:w="100"/>
-              <w:right w:type="dxa" w:w="140"/>
-            </w:tcMar>
-          </w:tcPr>
-          <w:p>
-            <w:pPr>
-              <w:spacing w:after="0" w:line="264"/>
-            </w:pPr>
-            <w:r>
-              <w:rPr>
-                <w:rFonts w:ascii="Calibri" w:cs="Calibri" w:eastAsia="Calibri" w:hAnsi="Calibri"/>
-                <w:color w:val="1B1B1B"/>
-                <w:sz w:val="19"/>
-                <w:szCs w:val="19"/>
-              </w:rPr>
-              <w:t xml:space="preserve">Análisis de marketing — análisis del servicio y socios estratégicos</w:t>
-            </w:r>
-          </w:p>
-        </w:tc>
-        <w:tc>
-          <w:tcPr>
-            <w:tcW w:type="dxa" w:w="2300"/>
-            <w:shd w:fill="F2F6F7" w:color="auto" w:val="clear"/>
-            <w:tcMar>
-              <w:top w:type="dxa" w:w="100"/>
-              <w:left w:type="dxa" w:w="140"/>
-              <w:bottom w:type="dxa" w:w="100"/>
-              <w:right w:type="dxa" w:w="140"/>
-            </w:tcMar>
-          </w:tcPr>
-          <w:p>
-            <w:pPr>
-              <w:spacing w:after="0" w:line="264"/>
-            </w:pPr>
-            <w:r>
-              <w:rPr>
-                <w:rFonts w:ascii="Calibri" w:cs="Calibri" w:eastAsia="Calibri" w:hAnsi="Calibri"/>
-                <w:color w:val="1B1B1B"/>
-                <w:sz w:val="19"/>
-                <w:szCs w:val="19"/>
-              </w:rPr>
-              <w:t xml:space="preserve">9 oct 2026</w:t>
-            </w:r>
-          </w:p>
-        </w:tc>
-        <w:tc>
-          <w:tcPr>
-            <w:tcW w:type="dxa" w:w="2300"/>
-            <w:shd w:fill="F2F6F7" w:color="auto" w:val="clear"/>
-            <w:tcMar>
-              <w:top w:type="dxa" w:w="100"/>
-              <w:left w:type="dxa" w:w="140"/>
-              <w:bottom w:type="dxa" w:w="100"/>
-              <w:right w:type="dxa" w:w="140"/>
-            </w:tcMar>
-          </w:tcPr>
-          <w:p>
-            <w:pPr>
-              <w:spacing w:after="0" w:line="264"/>
-            </w:pPr>
-            <w:r>
-              <w:rPr>
-                <w:rFonts w:ascii="Calibri" w:cs="Calibri" w:eastAsia="Calibri" w:hAnsi="Calibri"/>
-                <w:color w:val="1B1B1B"/>
-                <w:sz w:val="19"/>
-                <w:szCs w:val="19"/>
-              </w:rPr>
-              <w:t xml:space="preserve">Insumos de EL CLIENTE (A.3)</w:t>
-            </w:r>
-          </w:p>
-        </w:tc>
-      </w:tr>
-      <w:tr>
-        <w:trPr>
-          <w:cantSplit/>
-        </w:trPr>
-        <w:tc>
-          <w:tcPr>
-            <w:tcW w:type="dxa" w:w="5048"/>
-            <w:shd w:fill="FFFFFF" w:color="auto" w:val="clear"/>
-            <w:tcMar>
-              <w:top w:type="dxa" w:w="100"/>
-              <w:left w:type="dxa" w:w="140"/>
-              <w:bottom w:type="dxa" w:w="100"/>
-              <w:right w:type="dxa" w:w="140"/>
-            </w:tcMar>
-          </w:tcPr>
-          <w:p>
-            <w:pPr>
-              <w:spacing w:after="0" w:line="264"/>
-            </w:pPr>
-            <w:r>
-              <w:rPr>
-                <w:rFonts w:ascii="Calibri" w:cs="Calibri" w:eastAsia="Calibri" w:hAnsi="Calibri"/>
-                <w:color w:val="1B1B1B"/>
-                <w:sz w:val="19"/>
-                <w:szCs w:val="19"/>
-              </w:rPr>
-              <w:t xml:space="preserve">Análisis de marketing — FODA con estrategias cruzadas y objetivos SMART</w:t>
-            </w:r>
-          </w:p>
-        </w:tc>
-        <w:tc>
-          <w:tcPr>
-            <w:tcW w:type="dxa" w:w="2300"/>
-            <w:shd w:fill="FFFFFF" w:color="auto" w:val="clear"/>
-            <w:tcMar>
-              <w:top w:type="dxa" w:w="100"/>
-              <w:left w:type="dxa" w:w="140"/>
-              <w:bottom w:type="dxa" w:w="100"/>
-              <w:right w:type="dxa" w:w="140"/>
-            </w:tcMar>
-          </w:tcPr>
-          <w:p>
-            <w:pPr>
-              <w:spacing w:after="0" w:line="264"/>
-            </w:pPr>
-            <w:r>
-              <w:rPr>
-                <w:rFonts w:ascii="Calibri" w:cs="Calibri" w:eastAsia="Calibri" w:hAnsi="Calibri"/>
-                <w:color w:val="1B1B1B"/>
-                <w:sz w:val="19"/>
-                <w:szCs w:val="19"/>
-              </w:rPr>
-              <w:t xml:space="preserve">13 oct 2026</w:t>
-            </w:r>
-          </w:p>
-        </w:tc>
-        <w:tc>
-          <w:tcPr>
-            <w:tcW w:type="dxa" w:w="2300"/>
-            <w:shd w:fill="FFFFFF" w:color="auto" w:val="clear"/>
-            <w:tcMar>
-              <w:top w:type="dxa" w:w="100"/>
-              <w:left w:type="dxa" w:w="140"/>
-              <w:bottom w:type="dxa" w:w="100"/>
-              <w:right w:type="dxa" w:w="140"/>
-            </w:tcMar>
-          </w:tcPr>
-          <w:p>
-            <w:pPr>
-              <w:spacing w:after="0" w:line="264"/>
-            </w:pPr>
-            <w:r>
-              <w:rPr>
-                <w:rFonts w:ascii="Calibri" w:cs="Calibri" w:eastAsia="Calibri" w:hAnsi="Calibri"/>
-                <w:color w:val="1B1B1B"/>
-                <w:sz w:val="19"/>
-                <w:szCs w:val="19"/>
-              </w:rPr>
-              <w:t xml:space="preserve">Las secciones anteriores</w:t>
-            </w:r>
-          </w:p>
-        </w:tc>
-      </w:tr>
-      <w:tr>
-        <w:trPr>
-          <w:cantSplit/>
-        </w:trPr>
-        <w:tc>
-          <w:tcPr>
-            <w:tcW w:type="dxa" w:w="5048"/>
-            <w:shd w:fill="F2F6F7" w:color="auto" w:val="clear"/>
-            <w:tcMar>
-              <w:top w:type="dxa" w:w="100"/>
-              <w:left w:type="dxa" w:w="140"/>
-              <w:bottom w:type="dxa" w:w="100"/>
-              <w:right w:type="dxa" w:w="140"/>
-            </w:tcMar>
-          </w:tcPr>
-          <w:p>
-            <w:pPr>
-              <w:spacing w:after="0" w:line="264"/>
-            </w:pPr>
-            <w:r>
-              <w:rPr>
-                <w:rFonts w:ascii="Calibri" w:cs="Calibri" w:eastAsia="Calibri" w:hAnsi="Calibri"/>
-                <w:color w:val="1B1B1B"/>
-                <w:sz w:val="19"/>
-                <w:szCs w:val="19"/>
-              </w:rPr>
-              <w:t xml:space="preserve">Video de lanzamiento y pack de tres carruseles</w:t>
-            </w:r>
-          </w:p>
-        </w:tc>
-        <w:tc>
-          <w:tcPr>
-            <w:tcW w:type="dxa" w:w="2300"/>
-            <w:shd w:fill="F2F6F7" w:color="auto" w:val="clear"/>
-            <w:tcMar>
-              <w:top w:type="dxa" w:w="100"/>
-              <w:left w:type="dxa" w:w="140"/>
-              <w:bottom w:type="dxa" w:w="100"/>
-              <w:right w:type="dxa" w:w="140"/>
-            </w:tcMar>
-          </w:tcPr>
-          <w:p>
-            <w:pPr>
-              <w:spacing w:after="0" w:line="264"/>
-            </w:pPr>
-            <w:r>
-              <w:rPr>
-                <w:rFonts w:ascii="Calibri" w:cs="Calibri" w:eastAsia="Calibri" w:hAnsi="Calibri"/>
-                <w:color w:val="1B1B1B"/>
-                <w:sz w:val="19"/>
-                <w:szCs w:val="19"/>
-              </w:rPr>
-              <w:t xml:space="preserve">Víspera del lanzamiento</w:t>
-            </w:r>
-          </w:p>
-        </w:tc>
-        <w:tc>
-          <w:tcPr>
-            <w:tcW w:type="dxa" w:w="2300"/>
-            <w:shd w:fill="F2F6F7" w:color="auto" w:val="clear"/>
-            <w:tcMar>
-              <w:top w:type="dxa" w:w="100"/>
-              <w:left w:type="dxa" w:w="140"/>
-              <w:bottom w:type="dxa" w:w="100"/>
-              <w:right w:type="dxa" w:w="140"/>
-            </w:tcMar>
-          </w:tcPr>
-          <w:p>
-            <w:pPr>
-              <w:spacing w:after="0" w:line="264"/>
-            </w:pPr>
-            <w:r>
-              <w:rPr>
-                <w:rFonts w:ascii="Calibri" w:cs="Calibri" w:eastAsia="Calibri" w:hAnsi="Calibri"/>
-                <w:color w:val="1B1B1B"/>
-                <w:sz w:val="19"/>
-                <w:szCs w:val="19"/>
-              </w:rPr>
-              <w:t xml:space="preserve">Fecha de lanzamiento confirmada (A.3)</w:t>
-            </w:r>
-          </w:p>
-        </w:tc>
-      </w:tr>
-      <w:tr>
-        <w:trPr>
-          <w:cantSplit/>
-        </w:trPr>
-        <w:tc>
-          <w:tcPr>
-            <w:tcW w:type="dxa" w:w="5048"/>
-            <w:shd w:fill="FFFFFF" w:color="auto" w:val="clear"/>
-            <w:tcMar>
-              <w:top w:type="dxa" w:w="100"/>
-              <w:left w:type="dxa" w:w="140"/>
-              <w:bottom w:type="dxa" w:w="100"/>
-              <w:right w:type="dxa" w:w="140"/>
-            </w:tcMar>
-          </w:tcPr>
-          <w:p>
-            <w:pPr>
-              <w:spacing w:after="0" w:line="264"/>
-            </w:pPr>
-            <w:r>
-              <w:rPr>
-                <w:rFonts w:ascii="Calibri" w:cs="Calibri" w:eastAsia="Calibri" w:hAnsi="Calibri"/>
-                <w:color w:val="1B1B1B"/>
-                <w:sz w:val="19"/>
-                <w:szCs w:val="19"/>
-              </w:rPr>
-              <w:t xml:space="preserve">Ejecución de la semana de lanzamiento</w:t>
-            </w:r>
-          </w:p>
-        </w:tc>
-        <w:tc>
-          <w:tcPr>
-            <w:tcW w:type="dxa" w:w="2300"/>
-            <w:shd w:fill="FFFFFF" w:color="auto" w:val="clear"/>
-            <w:tcMar>
-              <w:top w:type="dxa" w:w="100"/>
-              <w:left w:type="dxa" w:w="140"/>
-              <w:bottom w:type="dxa" w:w="100"/>
-              <w:right w:type="dxa" w:w="140"/>
-            </w:tcMar>
-          </w:tcPr>
-          <w:p>
-            <w:pPr>
-              <w:spacing w:after="0" w:line="264"/>
-            </w:pPr>
-            <w:r>
-              <w:rPr>
-                <w:rFonts w:ascii="Calibri" w:cs="Calibri" w:eastAsia="Calibri" w:hAnsi="Calibri"/>
-                <w:color w:val="1B1B1B"/>
-                <w:sz w:val="19"/>
-                <w:szCs w:val="19"/>
-              </w:rPr>
-              <w:t xml:space="preserve">Semana del lanzamiento</w:t>
-            </w:r>
-          </w:p>
-        </w:tc>
-        <w:tc>
-          <w:tcPr>
-            <w:tcW w:type="dxa" w:w="2300"/>
-            <w:shd w:fill="FFFFFF" w:color="auto" w:val="clear"/>
-            <w:tcMar>
-              <w:top w:type="dxa" w:w="100"/>
-              <w:left w:type="dxa" w:w="140"/>
-              <w:bottom w:type="dxa" w:w="100"/>
-              <w:right w:type="dxa" w:w="140"/>
-            </w:tcMar>
-          </w:tcPr>
-          <w:p>
-            <w:pPr>
-              <w:spacing w:after="0" w:line="264"/>
-            </w:pPr>
-            <w:r>
-              <w:rPr>
-                <w:rFonts w:ascii="Calibri" w:cs="Calibri" w:eastAsia="Calibri" w:hAnsi="Calibri"/>
-                <w:color w:val="1B1B1B"/>
-                <w:sz w:val="19"/>
-                <w:szCs w:val="19"/>
-              </w:rPr>
-              <w:t xml:space="preserve">Fecha de lanzamiento confirmada (A.3)</w:t>
-            </w:r>
-          </w:p>
-        </w:tc>
-      </w:tr>
-      <w:tr>
-        <w:trPr>
-          <w:cantSplit/>
-        </w:trPr>
-        <w:tc>
-          <w:tcPr>
-            <w:tcW w:type="dxa" w:w="5048"/>
-            <w:shd w:fill="F2F6F7" w:color="auto" w:val="clear"/>
-            <w:tcMar>
-              <w:top w:type="dxa" w:w="100"/>
-              <w:left w:type="dxa" w:w="140"/>
-              <w:bottom w:type="dxa" w:w="100"/>
-              <w:right w:type="dxa" w:w="140"/>
-            </w:tcMar>
-          </w:tcPr>
-          <w:p>
-            <w:pPr>
-              <w:spacing w:after="0" w:line="264"/>
-            </w:pPr>
-            <w:r>
-              <w:rPr>
-                <w:rFonts w:ascii="Calibri" w:cs="Calibri" w:eastAsia="Calibri" w:hAnsi="Calibri"/>
-                <w:color w:val="1B1B1B"/>
-                <w:sz w:val="19"/>
-                <w:szCs w:val="19"/>
-              </w:rPr>
-              <w:t xml:space="preserve">Informe del mes 1 (lista de espera, audiencia, descargas iniciales)</w:t>
-            </w:r>
-          </w:p>
-        </w:tc>
-        <w:tc>
-          <w:tcPr>
-            <w:tcW w:type="dxa" w:w="2300"/>
-            <w:shd w:fill="F2F6F7" w:color="auto" w:val="clear"/>
-            <w:tcMar>
-              <w:top w:type="dxa" w:w="100"/>
-              <w:left w:type="dxa" w:w="140"/>
-              <w:bottom w:type="dxa" w:w="100"/>
-              <w:right w:type="dxa" w:w="140"/>
-            </w:tcMar>
-          </w:tcPr>
-          <w:p>
-            <w:pPr>
-              <w:spacing w:after="0" w:line="264"/>
-            </w:pPr>
-            <w:r>
-              <w:rPr>
-                <w:rFonts w:ascii="Calibri" w:cs="Calibri" w:eastAsia="Calibri" w:hAnsi="Calibri"/>
-                <w:color w:val="1B1B1B"/>
-                <w:sz w:val="19"/>
-                <w:szCs w:val="19"/>
-              </w:rPr>
-              <w:t xml:space="preserve">5 días hábiles tras el cierre de la semana de lanzamiento</w:t>
-            </w:r>
-          </w:p>
-        </w:tc>
-        <w:tc>
-          <w:tcPr>
-            <w:tcW w:type="dxa" w:w="2300"/>
-            <w:shd w:fill="F2F6F7" w:color="auto" w:val="clear"/>
-            <w:tcMar>
-              <w:top w:type="dxa" w:w="100"/>
-              <w:left w:type="dxa" w:w="140"/>
-              <w:bottom w:type="dxa" w:w="100"/>
-              <w:right w:type="dxa" w:w="140"/>
-            </w:tcMar>
-          </w:tcPr>
-          <w:p>
-            <w:pPr>
-              <w:spacing w:after="0" w:line="264"/>
-            </w:pPr>
-            <w:r>
-              <w:rPr>
-                <w:rFonts w:ascii="Calibri" w:cs="Calibri" w:eastAsia="Calibri" w:hAnsi="Calibri"/>
-                <w:color w:val="1B1B1B"/>
-                <w:sz w:val="19"/>
-                <w:szCs w:val="19"/>
-              </w:rPr>
-              <w:t xml:space="preserve">Datos de tienda que facilite EL CLIENTE</w:t>
-            </w:r>
-          </w:p>
-        </w:tc>
-      </w:tr>
-      <w:tr>
-        <w:trPr>
-          <w:cantSplit/>
-        </w:trPr>
-        <w:tc>
-          <w:tcPr>
-            <w:tcW w:type="dxa" w:w="5048"/>
-            <w:shd w:fill="FFFFFF" w:color="auto" w:val="clear"/>
-            <w:tcMar>
-              <w:top w:type="dxa" w:w="100"/>
-              <w:left w:type="dxa" w:w="140"/>
-              <w:bottom w:type="dxa" w:w="100"/>
-              <w:right w:type="dxa" w:w="140"/>
-            </w:tcMar>
-          </w:tcPr>
-          <w:p>
-            <w:pPr>
-              <w:spacing w:after="0" w:line="264"/>
-            </w:pPr>
-            <w:r>
-              <w:rPr>
-                <w:rFonts w:ascii="Calibri" w:cs="Calibri" w:eastAsia="Calibri" w:hAnsi="Calibri"/>
-                <w:color w:val="1B1B1B"/>
-                <w:sz w:val="19"/>
-                <w:szCs w:val="19"/>
-              </w:rPr>
-              <w:t xml:space="preserve">Calendario editorial de noviembre</w:t>
-            </w:r>
-          </w:p>
-        </w:tc>
-        <w:tc>
-          <w:tcPr>
-            <w:tcW w:type="dxa" w:w="2300"/>
-            <w:shd w:fill="FFFFFF" w:color="auto" w:val="clear"/>
-            <w:tcMar>
-              <w:top w:type="dxa" w:w="100"/>
-              <w:left w:type="dxa" w:w="140"/>
-              <w:bottom w:type="dxa" w:w="100"/>
-              <w:right w:type="dxa" w:w="140"/>
-            </w:tcMar>
-          </w:tcPr>
-          <w:p>
-            <w:pPr>
-              <w:spacing w:after="0" w:line="264"/>
-            </w:pPr>
-            <w:r>
-              <w:rPr>
-                <w:rFonts w:ascii="Calibri" w:cs="Calibri" w:eastAsia="Calibri" w:hAnsi="Calibri"/>
-                <w:color w:val="1B1B1B"/>
-                <w:sz w:val="19"/>
-                <w:szCs w:val="19"/>
-              </w:rPr>
-              <w:t xml:space="preserve">30 oct 2026</w:t>
-            </w:r>
-          </w:p>
-        </w:tc>
-        <w:tc>
-          <w:tcPr>
-            <w:tcW w:type="dxa" w:w="2300"/>
-            <w:shd w:fill="FFFFFF" w:color="auto" w:val="clear"/>
-            <w:tcMar>
-              <w:top w:type="dxa" w:w="100"/>
-              <w:left w:type="dxa" w:w="140"/>
-              <w:bottom w:type="dxa" w:w="100"/>
-              <w:right w:type="dxa" w:w="140"/>
-            </w:tcMar>
-          </w:tcPr>
-          <w:p>
-            <w:pPr>
-              <w:spacing w:after="0" w:line="264"/>
-            </w:pPr>
-            <w:r>
-              <w:rPr>
-                <w:rFonts w:ascii="Calibri" w:cs="Calibri" w:eastAsia="Calibri" w:hAnsi="Calibri"/>
-                <w:color w:val="1B1B1B"/>
-                <w:sz w:val="19"/>
-                <w:szCs w:val="19"/>
-              </w:rPr>
-              <w:t xml:space="preserve">—</w:t>
-            </w:r>
-          </w:p>
-        </w:tc>
-      </w:tr>
-      <w:tr>
-        <w:trPr>
-          <w:cantSplit/>
-        </w:trPr>
-        <w:tc>
-          <w:tcPr>
-            <w:tcW w:type="dxa" w:w="5048"/>
-            <w:shd w:fill="F2F6F7" w:color="auto" w:val="clear"/>
-            <w:tcMar>
-              <w:top w:type="dxa" w:w="100"/>
-              <w:left w:type="dxa" w:w="140"/>
-              <w:bottom w:type="dxa" w:w="100"/>
-              <w:right w:type="dxa" w:w="140"/>
-            </w:tcMar>
-          </w:tcPr>
-          <w:p>
-            <w:pPr>
-              <w:spacing w:after="0" w:line="264"/>
-            </w:pPr>
-            <w:r>
-              <w:rPr>
-                <w:rFonts w:ascii="Calibri" w:cs="Calibri" w:eastAsia="Calibri" w:hAnsi="Calibri"/>
-                <w:color w:val="1B1B1B"/>
-                <w:sz w:val="19"/>
-                <w:szCs w:val="19"/>
-              </w:rPr>
-              <w:t xml:space="preserve">Calendario editorial de diciembre</w:t>
-            </w:r>
-          </w:p>
-        </w:tc>
-        <w:tc>
-          <w:tcPr>
-            <w:tcW w:type="dxa" w:w="2300"/>
-            <w:shd w:fill="F2F6F7" w:color="auto" w:val="clear"/>
-            <w:tcMar>
-              <w:top w:type="dxa" w:w="100"/>
-              <w:left w:type="dxa" w:w="140"/>
-              <w:bottom w:type="dxa" w:w="100"/>
-              <w:right w:type="dxa" w:w="140"/>
-            </w:tcMar>
-          </w:tcPr>
-          <w:p>
-            <w:pPr>
-              <w:spacing w:after="0" w:line="264"/>
-            </w:pPr>
-            <w:r>
-              <w:rPr>
-                <w:rFonts w:ascii="Calibri" w:cs="Calibri" w:eastAsia="Calibri" w:hAnsi="Calibri"/>
-                <w:color w:val="1B1B1B"/>
-                <w:sz w:val="19"/>
-                <w:szCs w:val="19"/>
-              </w:rPr>
-              <w:t xml:space="preserve">27 nov 2026</w:t>
-            </w:r>
-          </w:p>
-        </w:tc>
-        <w:tc>
-          <w:tcPr>
-            <w:tcW w:type="dxa" w:w="2300"/>
-            <w:shd w:fill="F2F6F7" w:color="auto" w:val="clear"/>
-            <w:tcMar>
-              <w:top w:type="dxa" w:w="100"/>
-              <w:left w:type="dxa" w:w="140"/>
-              <w:bottom w:type="dxa" w:w="100"/>
-              <w:right w:type="dxa" w:w="140"/>
-            </w:tcMar>
-          </w:tcPr>
-          <w:p>
-            <w:pPr>
-              <w:spacing w:after="0" w:line="264"/>
-            </w:pPr>
-            <w:r>
-              <w:rPr>
-                <w:rFonts w:ascii="Calibri" w:cs="Calibri" w:eastAsia="Calibri" w:hAnsi="Calibri"/>
-                <w:color w:val="1B1B1B"/>
-                <w:sz w:val="19"/>
-                <w:szCs w:val="19"/>
-              </w:rPr>
-              <w:t xml:space="preserve">—</w:t>
-            </w:r>
-          </w:p>
-        </w:tc>
-      </w:tr>
-      <w:tr>
-        <w:trPr>
-          <w:cantSplit/>
-        </w:trPr>
-        <w:tc>
-          <w:tcPr>
-            <w:tcW w:type="dxa" w:w="5048"/>
-            <w:shd w:fill="FFFFFF" w:color="auto" w:val="clear"/>
-            <w:tcMar>
-              <w:top w:type="dxa" w:w="100"/>
-              <w:left w:type="dxa" w:w="140"/>
-              <w:bottom w:type="dxa" w:w="100"/>
-              <w:right w:type="dxa" w:w="140"/>
-            </w:tcMar>
-          </w:tcPr>
-          <w:p>
-            <w:pPr>
-              <w:spacing w:after="0" w:line="264"/>
-            </w:pPr>
-            <w:r>
-              <w:rPr>
-                <w:rFonts w:ascii="Calibri" w:cs="Calibri" w:eastAsia="Calibri" w:hAnsi="Calibri"/>
-                <w:color w:val="1B1B1B"/>
-                <w:sz w:val="19"/>
-                <w:szCs w:val="19"/>
-              </w:rPr>
-              <w:t xml:space="preserve">Informe mensual</w:t>
-            </w:r>
-          </w:p>
-        </w:tc>
-        <w:tc>
-          <w:tcPr>
-            <w:tcW w:type="dxa" w:w="2300"/>
-            <w:shd w:fill="FFFFFF" w:color="auto" w:val="clear"/>
-            <w:tcMar>
-              <w:top w:type="dxa" w:w="100"/>
-              <w:left w:type="dxa" w:w="140"/>
-              <w:bottom w:type="dxa" w:w="100"/>
-              <w:right w:type="dxa" w:w="140"/>
-            </w:tcMar>
-          </w:tcPr>
-          <w:p>
-            <w:pPr>
-              <w:spacing w:after="0" w:line="264"/>
-            </w:pPr>
-            <w:r>
-              <w:rPr>
-                <w:rFonts w:ascii="Calibri" w:cs="Calibri" w:eastAsia="Calibri" w:hAnsi="Calibri"/>
-                <w:color w:val="1B1B1B"/>
-                <w:sz w:val="19"/>
-                <w:szCs w:val="19"/>
-              </w:rPr>
-              <w:t xml:space="preserve">5 primeros días hábiles de cada mes</w:t>
-            </w:r>
-          </w:p>
-        </w:tc>
-        <w:tc>
-          <w:tcPr>
-            <w:tcW w:type="dxa" w:w="2300"/>
-            <w:shd w:fill="FFFFFF" w:color="auto" w:val="clear"/>
-            <w:tcMar>
-              <w:top w:type="dxa" w:w="100"/>
-              <w:left w:type="dxa" w:w="140"/>
-              <w:bottom w:type="dxa" w:w="100"/>
-              <w:right w:type="dxa" w:w="140"/>
-            </w:tcMar>
-          </w:tcPr>
-          <w:p>
-            <w:pPr>
-              <w:spacing w:after="0" w:line="264"/>
-            </w:pPr>
-            <w:r>
-              <w:rPr>
-                <w:rFonts w:ascii="Calibri" w:cs="Calibri" w:eastAsia="Calibri" w:hAnsi="Calibri"/>
-                <w:color w:val="1B1B1B"/>
-                <w:sz w:val="19"/>
-                <w:szCs w:val="19"/>
-              </w:rPr>
-              <w:t xml:space="preserve">—</w:t>
+              <w:t xml:space="preserve">Hasta el 31 de octubre de 2026</w:t>
             </w:r>
           </w:p>
         </w:tc>
@@ -7029,7 +6559,7 @@
     </w:p>
     <w:p>
       <w:pPr>
-        <w:spacing w:after="120"/>
+        <w:spacing w:after="120" w:before="60"/>
       </w:pPr>
       <w:r>
         <w:rPr>
@@ -7040,7 +6570,7 @@
           <w:sz w:val="24"/>
           <w:szCs w:val="24"/>
         </w:rPr>
-        <w:t xml:space="preserve">A.3  Insumos pendientes de EL CLIENTE y de su contacto técnico</w:t>
+        <w:t xml:space="preserve">A.3  Gestión mensual — desde el 9 de octubre de 2026</w:t>
       </w:r>
     </w:p>
     <w:tbl>
@@ -7056,9 +6586,8 @@
         </w:tblBorders>
       </w:tblPr>
       <w:tblGrid>
-        <w:gridCol w:w="5648"/>
-        <w:gridCol w:w="1900"/>
-        <w:gridCol w:w="2100"/>
+        <w:gridCol w:w="6648"/>
+        <w:gridCol w:w="3000"/>
       </w:tblGrid>
       <w:tr>
         <w:trPr>
@@ -7066,7 +6595,7 @@
         </w:trPr>
         <w:tc>
           <w:tcPr>
-            <w:tcW w:type="dxa" w:w="5648"/>
+            <w:tcW w:type="dxa" w:w="6648"/>
             <w:shd w:fill="00677E" w:color="auto" w:val="clear"/>
             <w:tcMar>
               <w:top w:type="dxa" w:w="100"/>
@@ -7089,13 +6618,13 @@
                 <w:sz w:val="16"/>
                 <w:szCs w:val="16"/>
               </w:rPr>
-              <w:t xml:space="preserve">INSUMO</w:t>
-            </w:r>
-          </w:p>
-        </w:tc>
-        <w:tc>
-          <w:tcPr>
-            <w:tcW w:type="dxa" w:w="1900"/>
+              <w:t xml:space="preserve">ENTREGABLE</w:t>
+            </w:r>
+          </w:p>
+        </w:tc>
+        <w:tc>
+          <w:tcPr>
+            <w:tcW w:type="dxa" w:w="3000"/>
             <w:shd w:fill="00677E" w:color="auto" w:val="clear"/>
             <w:tcMar>
               <w:top w:type="dxa" w:w="100"/>
@@ -7118,36 +6647,7 @@
                 <w:sz w:val="16"/>
                 <w:szCs w:val="16"/>
               </w:rPr>
-              <w:t xml:space="preserve">RESPONSABLE</w:t>
-            </w:r>
-          </w:p>
-        </w:tc>
-        <w:tc>
-          <w:tcPr>
-            <w:tcW w:type="dxa" w:w="2100"/>
-            <w:shd w:fill="00677E" w:color="auto" w:val="clear"/>
-            <w:tcMar>
-              <w:top w:type="dxa" w:w="100"/>
-              <w:left w:type="dxa" w:w="140"/>
-              <w:bottom w:type="dxa" w:w="100"/>
-              <w:right w:type="dxa" w:w="140"/>
-            </w:tcMar>
-          </w:tcPr>
-          <w:p>
-            <w:pPr>
-              <w:spacing w:after="0"/>
-            </w:pPr>
-            <w:r>
-              <w:rPr>
-                <w:rFonts w:ascii="Calibri" w:cs="Calibri" w:eastAsia="Calibri" w:hAnsi="Calibri"/>
-                <w:b/>
-                <w:bCs/>
-                <w:color w:val="FFFFFF"/>
-                <w:spacing w:val="20"/>
-                <w:sz w:val="16"/>
-                <w:szCs w:val="16"/>
-              </w:rPr>
-              <w:t xml:space="preserve">FECHA LÍMITE</w:t>
+              <w:t xml:space="preserve">PERIODICIDAD O PLAZO</w:t>
             </w:r>
           </w:p>
         </w:tc>
@@ -7158,7 +6658,7 @@
         </w:trPr>
         <w:tc>
           <w:tcPr>
-            <w:tcW w:type="dxa" w:w="5648"/>
+            <w:tcW w:type="dxa" w:w="6648"/>
             <w:shd w:fill="FFFFFF" w:color="auto" w:val="clear"/>
             <w:tcMar>
               <w:top w:type="dxa" w:w="100"/>
@@ -7178,13 +6678,13 @@
                 <w:sz w:val="19"/>
                 <w:szCs w:val="19"/>
               </w:rPr>
-              <w:t xml:space="preserve">Fecha exacta de lanzamiento en tiendas</w:t>
-            </w:r>
-          </w:p>
-        </w:tc>
-        <w:tc>
-          <w:tcPr>
-            <w:tcW w:type="dxa" w:w="1900"/>
+              <w:t xml:space="preserve">Calendario editorial del mes, para aprobación de EL CLIENTE</w:t>
+            </w:r>
+          </w:p>
+        </w:tc>
+        <w:tc>
+          <w:tcPr>
+            <w:tcW w:type="dxa" w:w="3000"/>
             <w:shd w:fill="FFFFFF" w:color="auto" w:val="clear"/>
             <w:tcMar>
               <w:top w:type="dxa" w:w="100"/>
@@ -7204,33 +6704,7 @@
                 <w:sz w:val="19"/>
                 <w:szCs w:val="19"/>
               </w:rPr>
-              <w:t xml:space="preserve">Kurt</w:t>
-            </w:r>
-          </w:p>
-        </w:tc>
-        <w:tc>
-          <w:tcPr>
-            <w:tcW w:type="dxa" w:w="2100"/>
-            <w:shd w:fill="FFFFFF" w:color="auto" w:val="clear"/>
-            <w:tcMar>
-              <w:top w:type="dxa" w:w="100"/>
-              <w:left w:type="dxa" w:w="140"/>
-              <w:bottom w:type="dxa" w:w="100"/>
-              <w:right w:type="dxa" w:w="140"/>
-            </w:tcMar>
-          </w:tcPr>
-          <w:p>
-            <w:pPr>
-              <w:spacing w:after="0" w:line="264"/>
-            </w:pPr>
-            <w:r>
-              <w:rPr>
-                <w:rFonts w:ascii="Calibri" w:cs="Calibri" w:eastAsia="Calibri" w:hAnsi="Calibri"/>
-                <w:color w:val="1B1B1B"/>
-                <w:sz w:val="19"/>
-                <w:szCs w:val="19"/>
-              </w:rPr>
-              <w:t xml:space="preserve">6 oct 2026</w:t>
+              <w:t xml:space="preserve">Antes del día 25 del mes anterior</w:t>
             </w:r>
           </w:p>
         </w:tc>
@@ -7241,7 +6715,7 @@
         </w:trPr>
         <w:tc>
           <w:tcPr>
-            <w:tcW w:type="dxa" w:w="5648"/>
+            <w:tcW w:type="dxa" w:w="6648"/>
             <w:shd w:fill="F2F6F7" w:color="auto" w:val="clear"/>
             <w:tcMar>
               <w:top w:type="dxa" w:w="100"/>
@@ -7261,13 +6735,13 @@
                 <w:sz w:val="19"/>
                 <w:szCs w:val="19"/>
               </w:rPr>
-              <w:t xml:space="preserve">Existencia y duración de la prueba gratuita</w:t>
-            </w:r>
-          </w:p>
-        </w:tc>
-        <w:tc>
-          <w:tcPr>
-            <w:tcW w:type="dxa" w:w="1900"/>
+              <w:t xml:space="preserve">Producción y publicación de contenido: hasta doce (12) videos de formato corto y seis (6) carruseles al mes, más stories de acompañamiento</w:t>
+            </w:r>
+          </w:p>
+        </w:tc>
+        <w:tc>
+          <w:tcPr>
+            <w:tcW w:type="dxa" w:w="3000"/>
             <w:shd w:fill="F2F6F7" w:color="auto" w:val="clear"/>
             <w:tcMar>
               <w:top w:type="dxa" w:w="100"/>
@@ -7287,33 +6761,7 @@
                 <w:sz w:val="19"/>
                 <w:szCs w:val="19"/>
               </w:rPr>
-              <w:t xml:space="preserve">Kurt</w:t>
-            </w:r>
-          </w:p>
-        </w:tc>
-        <w:tc>
-          <w:tcPr>
-            <w:tcW w:type="dxa" w:w="2100"/>
-            <w:shd w:fill="F2F6F7" w:color="auto" w:val="clear"/>
-            <w:tcMar>
-              <w:top w:type="dxa" w:w="100"/>
-              <w:left w:type="dxa" w:w="140"/>
-              <w:bottom w:type="dxa" w:w="100"/>
-              <w:right w:type="dxa" w:w="140"/>
-            </w:tcMar>
-          </w:tcPr>
-          <w:p>
-            <w:pPr>
-              <w:spacing w:after="0" w:line="264"/>
-            </w:pPr>
-            <w:r>
-              <w:rPr>
-                <w:rFonts w:ascii="Calibri" w:cs="Calibri" w:eastAsia="Calibri" w:hAnsi="Calibri"/>
-                <w:color w:val="1B1B1B"/>
-                <w:sz w:val="19"/>
-                <w:szCs w:val="19"/>
-              </w:rPr>
-              <w:t xml:space="preserve">6 oct 2026</w:t>
+              <w:t xml:space="preserve">Mensual, según el calendario aprobado</w:t>
             </w:r>
           </w:p>
         </w:tc>
@@ -7324,7 +6772,7 @@
         </w:trPr>
         <w:tc>
           <w:tcPr>
-            <w:tcW w:type="dxa" w:w="5648"/>
+            <w:tcW w:type="dxa" w:w="6648"/>
             <w:shd w:fill="FFFFFF" w:color="auto" w:val="clear"/>
             <w:tcMar>
               <w:top w:type="dxa" w:w="100"/>
@@ -7344,13 +6792,13 @@
                 <w:sz w:val="19"/>
                 <w:szCs w:val="19"/>
               </w:rPr>
-              <w:t xml:space="preserve">Cómo paga el usuario venezolano (métodos disponibles en tienda)</w:t>
-            </w:r>
-          </w:p>
-        </w:tc>
-        <w:tc>
-          <w:tcPr>
-            <w:tcW w:type="dxa" w:w="1900"/>
+              <w:t xml:space="preserve">Gestión de campañas pagadas en Meta</w:t>
+            </w:r>
+          </w:p>
+        </w:tc>
+        <w:tc>
+          <w:tcPr>
+            <w:tcW w:type="dxa" w:w="3000"/>
             <w:shd w:fill="FFFFFF" w:color="auto" w:val="clear"/>
             <w:tcMar>
               <w:top w:type="dxa" w:w="100"/>
@@ -7370,33 +6818,7 @@
                 <w:sz w:val="19"/>
                 <w:szCs w:val="19"/>
               </w:rPr>
-              <w:t xml:space="preserve">Kurt</w:t>
-            </w:r>
-          </w:p>
-        </w:tc>
-        <w:tc>
-          <w:tcPr>
-            <w:tcW w:type="dxa" w:w="2100"/>
-            <w:shd w:fill="FFFFFF" w:color="auto" w:val="clear"/>
-            <w:tcMar>
-              <w:top w:type="dxa" w:w="100"/>
-              <w:left w:type="dxa" w:w="140"/>
-              <w:bottom w:type="dxa" w:w="100"/>
-              <w:right w:type="dxa" w:w="140"/>
-            </w:tcMar>
-          </w:tcPr>
-          <w:p>
-            <w:pPr>
-              <w:spacing w:after="0" w:line="264"/>
-            </w:pPr>
-            <w:r>
-              <w:rPr>
-                <w:rFonts w:ascii="Calibri" w:cs="Calibri" w:eastAsia="Calibri" w:hAnsi="Calibri"/>
-                <w:color w:val="1B1B1B"/>
-                <w:sz w:val="19"/>
-                <w:szCs w:val="19"/>
-              </w:rPr>
-              <w:t xml:space="preserve">6 oct 2026</w:t>
+              <w:t xml:space="preserve">Continua, con el presupuesto de EL CLIENTE</w:t>
             </w:r>
           </w:p>
         </w:tc>
@@ -7407,7 +6829,7 @@
         </w:trPr>
         <w:tc>
           <w:tcPr>
-            <w:tcW w:type="dxa" w:w="5648"/>
+            <w:tcW w:type="dxa" w:w="6648"/>
             <w:shd w:fill="F2F6F7" w:color="auto" w:val="clear"/>
             <w:tcMar>
               <w:top w:type="dxa" w:w="100"/>
@@ -7427,13 +6849,13 @@
                 <w:sz w:val="19"/>
                 <w:szCs w:val="19"/>
               </w:rPr>
-              <w:t xml:space="preserve">Qué hace el plan el día después de una sesión no realizada</w:t>
-            </w:r>
-          </w:p>
-        </w:tc>
-        <w:tc>
-          <w:tcPr>
-            <w:tcW w:type="dxa" w:w="1900"/>
+              <w:t xml:space="preserve">Campaña de lanzamiento de la aplicación</w:t>
+            </w:r>
+          </w:p>
+        </w:tc>
+        <w:tc>
+          <w:tcPr>
+            <w:tcW w:type="dxa" w:w="3000"/>
             <w:shd w:fill="F2F6F7" w:color="auto" w:val="clear"/>
             <w:tcMar>
               <w:top w:type="dxa" w:w="100"/>
@@ -7453,33 +6875,7 @@
                 <w:sz w:val="19"/>
                 <w:szCs w:val="19"/>
               </w:rPr>
-              <w:t xml:space="preserve">Kurt</w:t>
-            </w:r>
-          </w:p>
-        </w:tc>
-        <w:tc>
-          <w:tcPr>
-            <w:tcW w:type="dxa" w:w="2100"/>
-            <w:shd w:fill="F2F6F7" w:color="auto" w:val="clear"/>
-            <w:tcMar>
-              <w:top w:type="dxa" w:w="100"/>
-              <w:left w:type="dxa" w:w="140"/>
-              <w:bottom w:type="dxa" w:w="100"/>
-              <w:right w:type="dxa" w:w="140"/>
-            </w:tcMar>
-          </w:tcPr>
-          <w:p>
-            <w:pPr>
-              <w:spacing w:after="0" w:line="264"/>
-            </w:pPr>
-            <w:r>
-              <w:rPr>
-                <w:rFonts w:ascii="Calibri" w:cs="Calibri" w:eastAsia="Calibri" w:hAnsi="Calibri"/>
-                <w:color w:val="1B1B1B"/>
-                <w:sz w:val="19"/>
-                <w:szCs w:val="19"/>
-              </w:rPr>
-              <w:t xml:space="preserve">6 oct 2026</w:t>
+              <w:t xml:space="preserve">En la fecha de lanzamiento que EL CLIENTE confirme por escrito</w:t>
             </w:r>
           </w:p>
         </w:tc>
@@ -7490,7 +6886,7 @@
         </w:trPr>
         <w:tc>
           <w:tcPr>
-            <w:tcW w:type="dxa" w:w="5648"/>
+            <w:tcW w:type="dxa" w:w="6648"/>
             <w:shd w:fill="FFFFFF" w:color="auto" w:val="clear"/>
             <w:tcMar>
               <w:top w:type="dxa" w:w="100"/>
@@ -7510,13 +6906,13 @@
                 <w:sz w:val="19"/>
                 <w:szCs w:val="19"/>
               </w:rPr>
-              <w:t xml:space="preserve">Qué planes entran en la versión de octubre y si la app emite eventos de analítica</w:t>
-            </w:r>
-          </w:p>
-        </w:tc>
-        <w:tc>
-          <w:tcPr>
-            <w:tcW w:type="dxa" w:w="1900"/>
+              <w:t xml:space="preserve">Informe mensual de resultados</w:t>
+            </w:r>
+          </w:p>
+        </w:tc>
+        <w:tc>
+          <w:tcPr>
+            <w:tcW w:type="dxa" w:w="3000"/>
             <w:shd w:fill="FFFFFF" w:color="auto" w:val="clear"/>
             <w:tcMar>
               <w:top w:type="dxa" w:w="100"/>
@@ -7536,33 +6932,7 @@
                 <w:sz w:val="19"/>
                 <w:szCs w:val="19"/>
               </w:rPr>
-              <w:t xml:space="preserve">Kurt</w:t>
-            </w:r>
-          </w:p>
-        </w:tc>
-        <w:tc>
-          <w:tcPr>
-            <w:tcW w:type="dxa" w:w="2100"/>
-            <w:shd w:fill="FFFFFF" w:color="auto" w:val="clear"/>
-            <w:tcMar>
-              <w:top w:type="dxa" w:w="100"/>
-              <w:left w:type="dxa" w:w="140"/>
-              <w:bottom w:type="dxa" w:w="100"/>
-              <w:right w:type="dxa" w:w="140"/>
-            </w:tcMar>
-          </w:tcPr>
-          <w:p>
-            <w:pPr>
-              <w:spacing w:after="0" w:line="264"/>
-            </w:pPr>
-            <w:r>
-              <w:rPr>
-                <w:rFonts w:ascii="Calibri" w:cs="Calibri" w:eastAsia="Calibri" w:hAnsi="Calibri"/>
-                <w:color w:val="1B1B1B"/>
-                <w:sz w:val="19"/>
-                <w:szCs w:val="19"/>
-              </w:rPr>
-              <w:t xml:space="preserve">6 oct 2026</w:t>
+              <w:t xml:space="preserve">Cinco primeros días hábiles del mes siguiente</w:t>
             </w:r>
           </w:p>
         </w:tc>
@@ -7573,7 +6943,7 @@
         </w:trPr>
         <w:tc>
           <w:tcPr>
-            <w:tcW w:type="dxa" w:w="5648"/>
+            <w:tcW w:type="dxa" w:w="6648"/>
             <w:shd w:fill="F2F6F7" w:color="auto" w:val="clear"/>
             <w:tcMar>
               <w:top w:type="dxa" w:w="100"/>
@@ -7593,13 +6963,13 @@
                 <w:sz w:val="19"/>
                 <w:szCs w:val="19"/>
               </w:rPr>
-              <w:t xml:space="preserve">Aprobación del tagline, las cuatro frases de campaña y el nombre de comunidad</w:t>
-            </w:r>
-          </w:p>
-        </w:tc>
-        <w:tc>
-          <w:tcPr>
-            <w:tcW w:type="dxa" w:w="1900"/>
+              <w:t xml:space="preserve">Reunión mensual de seguimiento</w:t>
+            </w:r>
+          </w:p>
+        </w:tc>
+        <w:tc>
+          <w:tcPr>
+            <w:tcW w:type="dxa" w:w="3000"/>
             <w:shd w:fill="F2F6F7" w:color="auto" w:val="clear"/>
             <w:tcMar>
               <w:top w:type="dxa" w:w="100"/>
@@ -7619,365 +6989,7 @@
                 <w:sz w:val="19"/>
                 <w:szCs w:val="19"/>
               </w:rPr>
-              <w:t xml:space="preserve">Ninro Libre</w:t>
-            </w:r>
-          </w:p>
-        </w:tc>
-        <w:tc>
-          <w:tcPr>
-            <w:tcW w:type="dxa" w:w="2100"/>
-            <w:shd w:fill="F2F6F7" w:color="auto" w:val="clear"/>
-            <w:tcMar>
-              <w:top w:type="dxa" w:w="100"/>
-              <w:left w:type="dxa" w:w="140"/>
-              <w:bottom w:type="dxa" w:w="100"/>
-              <w:right w:type="dxa" w:w="140"/>
-            </w:tcMar>
-          </w:tcPr>
-          <w:p>
-            <w:pPr>
-              <w:spacing w:after="0" w:line="264"/>
-            </w:pPr>
-            <w:r>
-              <w:rPr>
-                <w:rFonts w:ascii="Calibri" w:cs="Calibri" w:eastAsia="Calibri" w:hAnsi="Calibri"/>
-                <w:color w:val="1B1B1B"/>
-                <w:sz w:val="19"/>
-                <w:szCs w:val="19"/>
-              </w:rPr>
-              <w:t xml:space="preserve">6 oct 2026</w:t>
-            </w:r>
-          </w:p>
-        </w:tc>
-      </w:tr>
-      <w:tr>
-        <w:trPr>
-          <w:cantSplit/>
-        </w:trPr>
-        <w:tc>
-          <w:tcPr>
-            <w:tcW w:type="dxa" w:w="5648"/>
-            <w:shd w:fill="FFFFFF" w:color="auto" w:val="clear"/>
-            <w:tcMar>
-              <w:top w:type="dxa" w:w="100"/>
-              <w:left w:type="dxa" w:w="140"/>
-              <w:bottom w:type="dxa" w:w="100"/>
-              <w:right w:type="dxa" w:w="140"/>
-            </w:tcMar>
-          </w:tcPr>
-          <w:p>
-            <w:pPr>
-              <w:spacing w:after="0" w:line="264"/>
-            </w:pPr>
-            <w:r>
-              <w:rPr>
-                <w:rFonts w:ascii="Calibri" w:cs="Calibri" w:eastAsia="Calibri" w:hAnsi="Calibri"/>
-                <w:color w:val="1B1B1B"/>
-                <w:sz w:val="19"/>
-                <w:szCs w:val="19"/>
-              </w:rPr>
-              <w:t xml:space="preserve">Accesos de administración a redes sociales y al administrador comercial de Meta</w:t>
-            </w:r>
-          </w:p>
-        </w:tc>
-        <w:tc>
-          <w:tcPr>
-            <w:tcW w:type="dxa" w:w="1900"/>
-            <w:shd w:fill="FFFFFF" w:color="auto" w:val="clear"/>
-            <w:tcMar>
-              <w:top w:type="dxa" w:w="100"/>
-              <w:left w:type="dxa" w:w="140"/>
-              <w:bottom w:type="dxa" w:w="100"/>
-              <w:right w:type="dxa" w:w="140"/>
-            </w:tcMar>
-          </w:tcPr>
-          <w:p>
-            <w:pPr>
-              <w:spacing w:after="0" w:line="264"/>
-            </w:pPr>
-            <w:r>
-              <w:rPr>
-                <w:rFonts w:ascii="Calibri" w:cs="Calibri" w:eastAsia="Calibri" w:hAnsi="Calibri"/>
-                <w:color w:val="1B1B1B"/>
-                <w:sz w:val="19"/>
-                <w:szCs w:val="19"/>
-              </w:rPr>
-              <w:t xml:space="preserve">Ninro Libre</w:t>
-            </w:r>
-          </w:p>
-        </w:tc>
-        <w:tc>
-          <w:tcPr>
-            <w:tcW w:type="dxa" w:w="2100"/>
-            <w:shd w:fill="FFFFFF" w:color="auto" w:val="clear"/>
-            <w:tcMar>
-              <w:top w:type="dxa" w:w="100"/>
-              <w:left w:type="dxa" w:w="140"/>
-              <w:bottom w:type="dxa" w:w="100"/>
-              <w:right w:type="dxa" w:w="140"/>
-            </w:tcMar>
-          </w:tcPr>
-          <w:p>
-            <w:pPr>
-              <w:spacing w:after="0" w:line="264"/>
-            </w:pPr>
-            <w:r>
-              <w:rPr>
-                <w:rFonts w:ascii="Calibri" w:cs="Calibri" w:eastAsia="Calibri" w:hAnsi="Calibri"/>
-                <w:color w:val="1B1B1B"/>
-                <w:sz w:val="19"/>
-                <w:szCs w:val="19"/>
-              </w:rPr>
-              <w:t xml:space="preserve">6 oct 2026</w:t>
-            </w:r>
-          </w:p>
-        </w:tc>
-      </w:tr>
-      <w:tr>
-        <w:trPr>
-          <w:cantSplit/>
-        </w:trPr>
-        <w:tc>
-          <w:tcPr>
-            <w:tcW w:type="dxa" w:w="5648"/>
-            <w:shd w:fill="F2F6F7" w:color="auto" w:val="clear"/>
-            <w:tcMar>
-              <w:top w:type="dxa" w:w="100"/>
-              <w:left w:type="dxa" w:w="140"/>
-              <w:bottom w:type="dxa" w:w="100"/>
-              <w:right w:type="dxa" w:w="140"/>
-            </w:tcMar>
-          </w:tcPr>
-          <w:p>
-            <w:pPr>
-              <w:spacing w:after="0" w:line="264"/>
-            </w:pPr>
-            <w:r>
-              <w:rPr>
-                <w:rFonts w:ascii="Calibri" w:cs="Calibri" w:eastAsia="Calibri" w:hAnsi="Calibri"/>
-                <w:color w:val="1B1B1B"/>
-                <w:sz w:val="19"/>
-                <w:szCs w:val="19"/>
-              </w:rPr>
-              <w:t xml:space="preserve">Socios estratégicos y competencia local (cuentas y entrenadores de referencia)</w:t>
-            </w:r>
-          </w:p>
-        </w:tc>
-        <w:tc>
-          <w:tcPr>
-            <w:tcW w:type="dxa" w:w="1900"/>
-            <w:shd w:fill="F2F6F7" w:color="auto" w:val="clear"/>
-            <w:tcMar>
-              <w:top w:type="dxa" w:w="100"/>
-              <w:left w:type="dxa" w:w="140"/>
-              <w:bottom w:type="dxa" w:w="100"/>
-              <w:right w:type="dxa" w:w="140"/>
-            </w:tcMar>
-          </w:tcPr>
-          <w:p>
-            <w:pPr>
-              <w:spacing w:after="0" w:line="264"/>
-            </w:pPr>
-            <w:r>
-              <w:rPr>
-                <w:rFonts w:ascii="Calibri" w:cs="Calibri" w:eastAsia="Calibri" w:hAnsi="Calibri"/>
-                <w:color w:val="1B1B1B"/>
-                <w:sz w:val="19"/>
-                <w:szCs w:val="19"/>
-              </w:rPr>
-              <w:t xml:space="preserve">Ninro Libre</w:t>
-            </w:r>
-          </w:p>
-        </w:tc>
-        <w:tc>
-          <w:tcPr>
-            <w:tcW w:type="dxa" w:w="2100"/>
-            <w:shd w:fill="F2F6F7" w:color="auto" w:val="clear"/>
-            <w:tcMar>
-              <w:top w:type="dxa" w:w="100"/>
-              <w:left w:type="dxa" w:w="140"/>
-              <w:bottom w:type="dxa" w:w="100"/>
-              <w:right w:type="dxa" w:w="140"/>
-            </w:tcMar>
-          </w:tcPr>
-          <w:p>
-            <w:pPr>
-              <w:spacing w:after="0" w:line="264"/>
-            </w:pPr>
-            <w:r>
-              <w:rPr>
-                <w:rFonts w:ascii="Calibri" w:cs="Calibri" w:eastAsia="Calibri" w:hAnsi="Calibri"/>
-                <w:color w:val="1B1B1B"/>
-                <w:sz w:val="19"/>
-                <w:szCs w:val="19"/>
-              </w:rPr>
-              <w:t xml:space="preserve">6 oct 2026</w:t>
-            </w:r>
-          </w:p>
-        </w:tc>
-      </w:tr>
-      <w:tr>
-        <w:trPr>
-          <w:cantSplit/>
-        </w:trPr>
-        <w:tc>
-          <w:tcPr>
-            <w:tcW w:type="dxa" w:w="5648"/>
-            <w:shd w:fill="FFFFFF" w:color="auto" w:val="clear"/>
-            <w:tcMar>
-              <w:top w:type="dxa" w:w="100"/>
-              <w:left w:type="dxa" w:w="140"/>
-              <w:bottom w:type="dxa" w:w="100"/>
-              <w:right w:type="dxa" w:w="140"/>
-            </w:tcMar>
-          </w:tcPr>
-          <w:p>
-            <w:pPr>
-              <w:spacing w:after="0" w:line="264"/>
-            </w:pPr>
-            <w:r>
-              <w:rPr>
-                <w:rFonts w:ascii="Calibri" w:cs="Calibri" w:eastAsia="Calibri" w:hAnsi="Calibri"/>
-                <w:color w:val="1B1B1B"/>
-                <w:sz w:val="19"/>
-                <w:szCs w:val="19"/>
-              </w:rPr>
-              <w:t xml:space="preserve">Registro de marca, dominio y nombres de usuario en redes</w:t>
-            </w:r>
-          </w:p>
-        </w:tc>
-        <w:tc>
-          <w:tcPr>
-            <w:tcW w:type="dxa" w:w="1900"/>
-            <w:shd w:fill="FFFFFF" w:color="auto" w:val="clear"/>
-            <w:tcMar>
-              <w:top w:type="dxa" w:w="100"/>
-              <w:left w:type="dxa" w:w="140"/>
-              <w:bottom w:type="dxa" w:w="100"/>
-              <w:right w:type="dxa" w:w="140"/>
-            </w:tcMar>
-          </w:tcPr>
-          <w:p>
-            <w:pPr>
-              <w:spacing w:after="0" w:line="264"/>
-            </w:pPr>
-            <w:r>
-              <w:rPr>
-                <w:rFonts w:ascii="Calibri" w:cs="Calibri" w:eastAsia="Calibri" w:hAnsi="Calibri"/>
-                <w:color w:val="1B1B1B"/>
-                <w:sz w:val="19"/>
-                <w:szCs w:val="19"/>
-              </w:rPr>
-              <w:t xml:space="preserve">Ninro Libre</w:t>
-            </w:r>
-          </w:p>
-        </w:tc>
-        <w:tc>
-          <w:tcPr>
-            <w:tcW w:type="dxa" w:w="2100"/>
-            <w:shd w:fill="FFFFFF" w:color="auto" w:val="clear"/>
-            <w:tcMar>
-              <w:top w:type="dxa" w:w="100"/>
-              <w:left w:type="dxa" w:w="140"/>
-              <w:bottom w:type="dxa" w:w="100"/>
-              <w:right w:type="dxa" w:w="140"/>
-            </w:tcMar>
-          </w:tcPr>
-          <w:p>
-            <w:pPr>
-              <w:spacing w:after="0" w:line="264"/>
-            </w:pPr>
-            <w:r>
-              <w:rPr>
-                <w:rFonts w:ascii="Calibri" w:cs="Calibri" w:eastAsia="Calibri" w:hAnsi="Calibri"/>
-                <w:color w:val="1B1B1B"/>
-                <w:sz w:val="19"/>
-                <w:szCs w:val="19"/>
-              </w:rPr>
-              <w:t xml:space="preserve">Antes del lanzamiento</w:t>
-            </w:r>
-          </w:p>
-        </w:tc>
-      </w:tr>
-      <w:tr>
-        <w:trPr>
-          <w:cantSplit/>
-        </w:trPr>
-        <w:tc>
-          <w:tcPr>
-            <w:tcW w:type="dxa" w:w="5648"/>
-            <w:shd w:fill="F2F6F7" w:color="auto" w:val="clear"/>
-            <w:tcMar>
-              <w:top w:type="dxa" w:w="100"/>
-              <w:left w:type="dxa" w:w="140"/>
-              <w:bottom w:type="dxa" w:w="100"/>
-              <w:right w:type="dxa" w:w="140"/>
-            </w:tcMar>
-          </w:tcPr>
-          <w:p>
-            <w:pPr>
-              <w:spacing w:after="0" w:line="264"/>
-            </w:pPr>
-            <w:r>
-              <w:rPr>
-                <w:rFonts w:ascii="Calibri" w:cs="Calibri" w:eastAsia="Calibri" w:hAnsi="Calibri"/>
-                <w:color w:val="1B1B1B"/>
-                <w:sz w:val="19"/>
-                <w:szCs w:val="19"/>
-              </w:rPr>
-              <w:t xml:space="preserve">Meta de negocio a tres años</w:t>
-            </w:r>
-          </w:p>
-        </w:tc>
-        <w:tc>
-          <w:tcPr>
-            <w:tcW w:type="dxa" w:w="1900"/>
-            <w:shd w:fill="F2F6F7" w:color="auto" w:val="clear"/>
-            <w:tcMar>
-              <w:top w:type="dxa" w:w="100"/>
-              <w:left w:type="dxa" w:w="140"/>
-              <w:bottom w:type="dxa" w:w="100"/>
-              <w:right w:type="dxa" w:w="140"/>
-            </w:tcMar>
-          </w:tcPr>
-          <w:p>
-            <w:pPr>
-              <w:spacing w:after="0" w:line="264"/>
-            </w:pPr>
-            <w:r>
-              <w:rPr>
-                <w:rFonts w:ascii="Calibri" w:cs="Calibri" w:eastAsia="Calibri" w:hAnsi="Calibri"/>
-                <w:color w:val="1B1B1B"/>
-                <w:sz w:val="19"/>
-                <w:szCs w:val="19"/>
-              </w:rPr>
-              <w:t xml:space="preserve">Ninro Libre</w:t>
-            </w:r>
-          </w:p>
-        </w:tc>
-        <w:tc>
-          <w:tcPr>
-            <w:tcW w:type="dxa" w:w="2100"/>
-            <w:shd w:fill="F2F6F7" w:color="auto" w:val="clear"/>
-            <w:tcMar>
-              <w:top w:type="dxa" w:w="100"/>
-              <w:left w:type="dxa" w:w="140"/>
-              <w:bottom w:type="dxa" w:w="100"/>
-              <w:right w:type="dxa" w:w="140"/>
-            </w:tcMar>
-          </w:tcPr>
-          <w:p>
-            <w:pPr>
-              <w:spacing w:after="0" w:line="264"/>
-            </w:pPr>
-            <w:r>
-              <w:rPr>
-                <w:rFonts w:ascii="Calibri" w:cs="Calibri" w:eastAsia="Calibri" w:hAnsi="Calibri"/>
-                <w:color w:val="1B1B1B"/>
-                <w:sz w:val="19"/>
-                <w:szCs w:val="19"/>
-              </w:rPr>
-              <w:t xml:space="preserve">31 oct 2026</w:t>
+              <w:t xml:space="preserve">Una al mes, en la fecha que acuerden las partes</w:t>
             </w:r>
           </w:p>
         </w:tc>
@@ -9941,18 +8953,55 @@
     </w:p>
     <w:p>
       <w:pPr>
-        <w:spacing w:after="120"/>
+        <w:spacing w:after="140" w:line="300"/>
+        <w:jc w:val="both"/>
+      </w:pPr>
+      <w:r>
+        <w:rPr>
+          <w:rFonts w:ascii="Calibri" w:cs="Calibri" w:eastAsia="Calibri" w:hAnsi="Calibri"/>
+          <w:color w:val="3C3C3C"/>
+          <w:sz w:val="21"/>
+          <w:szCs w:val="21"/>
+        </w:rPr>
+        <w:t xml:space="preserve">La medición de conversión, suscriptores y retención requiere que la aplicación emita eventos de analítica o que EL CLIENTE facilite los datos de las consolas de App Store y Google Play. Sin esos datos, LA AGENCIA informará solo de los indicadores que pueda medir en redes y en pauta.</w:t>
+      </w:r>
+    </w:p>
+    <w:p>
+      <w:r>
+        <w:br w:type="page"/>
+      </w:r>
+    </w:p>
+    <w:p>
+      <w:pPr>
+        <w:pBdr>
+          <w:bottom w:val="single" w:color="079CB5" w:sz="12" w:space="8"/>
+        </w:pBdr>
+        <w:spacing w:after="60" w:before="0"/>
       </w:pPr>
       <w:r>
         <w:rPr>
           <w:rFonts w:ascii="Georgia" w:cs="Georgia" w:eastAsia="Georgia" w:hAnsi="Georgia"/>
           <w:b/>
           <w:bCs/>
-          <w:color w:val="00677E"/>
-          <w:sz w:val="24"/>
-          <w:szCs w:val="24"/>
-        </w:rPr>
-        <w:t xml:space="preserve">Metas del pre-lanzamiento</w:t>
+          <w:color w:val="1B1B1B"/>
+          <w:sz w:val="30"/>
+          <w:szCs w:val="30"/>
+        </w:rPr>
+        <w:t xml:space="preserve">Anexo D · Directorio del proyecto</w:t>
+      </w:r>
+    </w:p>
+    <w:p>
+      <w:pPr>
+        <w:spacing w:after="220"/>
+      </w:pPr>
+      <w:r>
+        <w:rPr>
+          <w:rFonts w:ascii="Calibri" w:cs="Calibri" w:eastAsia="Calibri" w:hAnsi="Calibri"/>
+          <w:color w:val="6E7F82"/>
+          <w:sz w:val="19"/>
+          <w:szCs w:val="19"/>
+        </w:rPr>
+        <w:t xml:space="preserve">Datos de contacto para comunicaciones y notificaciones (cláusulas décima novena y vigésima cuarta).</w:t>
       </w:r>
     </w:p>
     <w:tbl>
@@ -9968,9 +9017,11 @@
         </w:tblBorders>
       </w:tblPr>
       <w:tblGrid>
-        <w:gridCol w:w="4400"/>
+        <w:gridCol w:w="2048"/>
         <w:gridCol w:w="2300"/>
-        <w:gridCol w:w="2948"/>
+        <w:gridCol w:w="1500"/>
+        <w:gridCol w:w="1500"/>
+        <w:gridCol w:w="2300"/>
       </w:tblGrid>
       <w:tr>
         <w:trPr>
@@ -9978,7 +9029,7 @@
         </w:trPr>
         <w:tc>
           <w:tcPr>
-            <w:tcW w:type="dxa" w:w="4400"/>
+            <w:tcW w:type="dxa" w:w="2048"/>
             <w:shd w:fill="00677E" w:color="auto" w:val="clear"/>
             <w:tcMar>
               <w:top w:type="dxa" w:w="100"/>
@@ -10001,7 +9052,7 @@
                 <w:sz w:val="16"/>
                 <w:szCs w:val="16"/>
               </w:rPr>
-              <w:t xml:space="preserve">INDICADOR</w:t>
+              <w:t xml:space="preserve">NOMBRE</w:t>
             </w:r>
           </w:p>
         </w:tc>
@@ -10030,13 +9081,13 @@
                 <w:sz w:val="16"/>
                 <w:szCs w:val="16"/>
               </w:rPr>
-              <w:t xml:space="preserve">META</w:t>
-            </w:r>
-          </w:p>
-        </w:tc>
-        <w:tc>
-          <w:tcPr>
-            <w:tcW w:type="dxa" w:w="2948"/>
+              <w:t xml:space="preserve">ROL</w:t>
+            </w:r>
+          </w:p>
+        </w:tc>
+        <w:tc>
+          <w:tcPr>
+            <w:tcW w:type="dxa" w:w="1500"/>
             <w:shd w:fill="00677E" w:color="auto" w:val="clear"/>
             <w:tcMar>
               <w:top w:type="dxa" w:w="100"/>
@@ -10059,345 +9110,13 @@
                 <w:sz w:val="16"/>
                 <w:szCs w:val="16"/>
               </w:rPr>
-              <w:t xml:space="preserve">FECHA DE CORTE</w:t>
-            </w:r>
-          </w:p>
-        </w:tc>
-      </w:tr>
-      <w:tr>
-        <w:trPr>
-          <w:cantSplit/>
-        </w:trPr>
-        <w:tc>
-          <w:tcPr>
-            <w:tcW w:type="dxa" w:w="4400"/>
-            <w:shd w:fill="FFFFFF" w:color="auto" w:val="clear"/>
-            <w:tcMar>
-              <w:top w:type="dxa" w:w="100"/>
-              <w:left w:type="dxa" w:w="140"/>
-              <w:bottom w:type="dxa" w:w="100"/>
-              <w:right w:type="dxa" w:w="140"/>
-            </w:tcMar>
-          </w:tcPr>
-          <w:p>
-            <w:pPr>
-              <w:spacing w:after="0" w:line="264"/>
-            </w:pPr>
-            <w:r>
-              <w:rPr>
-                <w:rFonts w:ascii="Calibri" w:cs="Calibri" w:eastAsia="Calibri" w:hAnsi="Calibri"/>
-                <w:color w:val="1B1B1B"/>
-                <w:sz w:val="19"/>
-                <w:szCs w:val="19"/>
-              </w:rPr>
-              <w:t xml:space="preserve">Lista de espera (canal de WhatsApp)</w:t>
-            </w:r>
-          </w:p>
-        </w:tc>
-        <w:tc>
-          <w:tcPr>
-            <w:tcW w:type="dxa" w:w="2300"/>
-            <w:shd w:fill="FFFFFF" w:color="auto" w:val="clear"/>
-            <w:tcMar>
-              <w:top w:type="dxa" w:w="100"/>
-              <w:left w:type="dxa" w:w="140"/>
-              <w:bottom w:type="dxa" w:w="100"/>
-              <w:right w:type="dxa" w:w="140"/>
-            </w:tcMar>
-          </w:tcPr>
-          <w:p>
-            <w:pPr>
-              <w:spacing w:after="0" w:line="264"/>
-            </w:pPr>
-            <w:r>
-              <w:rPr>
-                <w:rFonts w:ascii="Calibri" w:cs="Calibri" w:eastAsia="Calibri" w:hAnsi="Calibri"/>
-                <w:color w:val="1B1B1B"/>
-                <w:sz w:val="19"/>
-                <w:szCs w:val="19"/>
-              </w:rPr>
-              <w:t xml:space="preserve">400 contactos</w:t>
-            </w:r>
-          </w:p>
-        </w:tc>
-        <w:tc>
-          <w:tcPr>
-            <w:tcW w:type="dxa" w:w="2948"/>
-            <w:shd w:fill="FFFFFF" w:color="auto" w:val="clear"/>
-            <w:tcMar>
-              <w:top w:type="dxa" w:w="100"/>
-              <w:left w:type="dxa" w:w="140"/>
-              <w:bottom w:type="dxa" w:w="100"/>
-              <w:right w:type="dxa" w:w="140"/>
-            </w:tcMar>
-          </w:tcPr>
-          <w:p>
-            <w:pPr>
-              <w:spacing w:after="0" w:line="264"/>
-            </w:pPr>
-            <w:r>
-              <w:rPr>
-                <w:rFonts w:ascii="Calibri" w:cs="Calibri" w:eastAsia="Calibri" w:hAnsi="Calibri"/>
-                <w:color w:val="1B1B1B"/>
-                <w:sz w:val="19"/>
-                <w:szCs w:val="19"/>
-              </w:rPr>
-              <w:t xml:space="preserve">Víspera del lanzamiento</w:t>
-            </w:r>
-          </w:p>
-        </w:tc>
-      </w:tr>
-      <w:tr>
-        <w:trPr>
-          <w:cantSplit/>
-        </w:trPr>
-        <w:tc>
-          <w:tcPr>
-            <w:tcW w:type="dxa" w:w="4400"/>
-            <w:shd w:fill="F2F6F7" w:color="auto" w:val="clear"/>
-            <w:tcMar>
-              <w:top w:type="dxa" w:w="100"/>
-              <w:left w:type="dxa" w:w="140"/>
-              <w:bottom w:type="dxa" w:w="100"/>
-              <w:right w:type="dxa" w:w="140"/>
-            </w:tcMar>
-          </w:tcPr>
-          <w:p>
-            <w:pPr>
-              <w:spacing w:after="0" w:line="264"/>
-            </w:pPr>
-            <w:r>
-              <w:rPr>
-                <w:rFonts w:ascii="Calibri" w:cs="Calibri" w:eastAsia="Calibri" w:hAnsi="Calibri"/>
-                <w:color w:val="1B1B1B"/>
-                <w:sz w:val="19"/>
-                <w:szCs w:val="19"/>
-              </w:rPr>
-              <w:t xml:space="preserve">Descargas el día del lanzamiento</w:t>
-            </w:r>
-          </w:p>
-        </w:tc>
-        <w:tc>
-          <w:tcPr>
-            <w:tcW w:type="dxa" w:w="2300"/>
-            <w:shd w:fill="F2F6F7" w:color="auto" w:val="clear"/>
-            <w:tcMar>
-              <w:top w:type="dxa" w:w="100"/>
-              <w:left w:type="dxa" w:w="140"/>
-              <w:bottom w:type="dxa" w:w="100"/>
-              <w:right w:type="dxa" w:w="140"/>
-            </w:tcMar>
-          </w:tcPr>
-          <w:p>
-            <w:pPr>
-              <w:spacing w:after="0" w:line="264"/>
-            </w:pPr>
-            <w:r>
-              <w:rPr>
-                <w:rFonts w:ascii="Calibri" w:cs="Calibri" w:eastAsia="Calibri" w:hAnsi="Calibri"/>
-                <w:color w:val="1B1B1B"/>
-                <w:sz w:val="19"/>
-                <w:szCs w:val="19"/>
-              </w:rPr>
-              <w:t xml:space="preserve">150</w:t>
-            </w:r>
-          </w:p>
-        </w:tc>
-        <w:tc>
-          <w:tcPr>
-            <w:tcW w:type="dxa" w:w="2948"/>
-            <w:shd w:fill="F2F6F7" w:color="auto" w:val="clear"/>
-            <w:tcMar>
-              <w:top w:type="dxa" w:w="100"/>
-              <w:left w:type="dxa" w:w="140"/>
-              <w:bottom w:type="dxa" w:w="100"/>
-              <w:right w:type="dxa" w:w="140"/>
-            </w:tcMar>
-          </w:tcPr>
-          <w:p>
-            <w:pPr>
-              <w:spacing w:after="0" w:line="264"/>
-            </w:pPr>
-            <w:r>
-              <w:rPr>
-                <w:rFonts w:ascii="Calibri" w:cs="Calibri" w:eastAsia="Calibri" w:hAnsi="Calibri"/>
-                <w:color w:val="1B1B1B"/>
-                <w:sz w:val="19"/>
-                <w:szCs w:val="19"/>
-              </w:rPr>
-              <w:t xml:space="preserve">Día del lanzamiento</w:t>
-            </w:r>
-          </w:p>
-        </w:tc>
-      </w:tr>
-      <w:tr>
-        <w:trPr>
-          <w:cantSplit/>
-        </w:trPr>
-        <w:tc>
-          <w:tcPr>
-            <w:tcW w:type="dxa" w:w="4400"/>
-            <w:shd w:fill="FFFFFF" w:color="auto" w:val="clear"/>
-            <w:tcMar>
-              <w:top w:type="dxa" w:w="100"/>
-              <w:left w:type="dxa" w:w="140"/>
-              <w:bottom w:type="dxa" w:w="100"/>
-              <w:right w:type="dxa" w:w="140"/>
-            </w:tcMar>
-          </w:tcPr>
-          <w:p>
-            <w:pPr>
-              <w:spacing w:after="0" w:line="264"/>
-            </w:pPr>
-            <w:r>
-              <w:rPr>
-                <w:rFonts w:ascii="Calibri" w:cs="Calibri" w:eastAsia="Calibri" w:hAnsi="Calibri"/>
-                <w:color w:val="1B1B1B"/>
-                <w:sz w:val="19"/>
-                <w:szCs w:val="19"/>
-              </w:rPr>
-              <w:t xml:space="preserve">Reseñas en tienda el día del lanzamiento</w:t>
-            </w:r>
-          </w:p>
-        </w:tc>
-        <w:tc>
-          <w:tcPr>
-            <w:tcW w:type="dxa" w:w="2300"/>
-            <w:shd w:fill="FFFFFF" w:color="auto" w:val="clear"/>
-            <w:tcMar>
-              <w:top w:type="dxa" w:w="100"/>
-              <w:left w:type="dxa" w:w="140"/>
-              <w:bottom w:type="dxa" w:w="100"/>
-              <w:right w:type="dxa" w:w="140"/>
-            </w:tcMar>
-          </w:tcPr>
-          <w:p>
-            <w:pPr>
-              <w:spacing w:after="0" w:line="264"/>
-            </w:pPr>
-            <w:r>
-              <w:rPr>
-                <w:rFonts w:ascii="Calibri" w:cs="Calibri" w:eastAsia="Calibri" w:hAnsi="Calibri"/>
-                <w:color w:val="1B1B1B"/>
-                <w:sz w:val="19"/>
-                <w:szCs w:val="19"/>
-              </w:rPr>
-              <w:t xml:space="preserve">10</w:t>
-            </w:r>
-          </w:p>
-        </w:tc>
-        <w:tc>
-          <w:tcPr>
-            <w:tcW w:type="dxa" w:w="2948"/>
-            <w:shd w:fill="FFFFFF" w:color="auto" w:val="clear"/>
-            <w:tcMar>
-              <w:top w:type="dxa" w:w="100"/>
-              <w:left w:type="dxa" w:w="140"/>
-              <w:bottom w:type="dxa" w:w="100"/>
-              <w:right w:type="dxa" w:w="140"/>
-            </w:tcMar>
-          </w:tcPr>
-          <w:p>
-            <w:pPr>
-              <w:spacing w:after="0" w:line="264"/>
-            </w:pPr>
-            <w:r>
-              <w:rPr>
-                <w:rFonts w:ascii="Calibri" w:cs="Calibri" w:eastAsia="Calibri" w:hAnsi="Calibri"/>
-                <w:color w:val="1B1B1B"/>
-                <w:sz w:val="19"/>
-                <w:szCs w:val="19"/>
-              </w:rPr>
-              <w:t xml:space="preserve">Día del lanzamiento</w:t>
-            </w:r>
-          </w:p>
-        </w:tc>
-      </w:tr>
-    </w:tbl>
-    <w:p>
-      <w:pPr>
-        <w:spacing w:after="220"/>
-      </w:pPr>
-    </w:p>
-    <w:p>
-      <w:pPr>
-        <w:spacing w:after="140" w:line="300"/>
-        <w:jc w:val="both"/>
-      </w:pPr>
-      <w:r>
-        <w:rPr>
-          <w:rFonts w:ascii="Calibri" w:cs="Calibri" w:eastAsia="Calibri" w:hAnsi="Calibri"/>
-          <w:color w:val="3C3C3C"/>
-          <w:sz w:val="21"/>
-          <w:szCs w:val="21"/>
-        </w:rPr>
-        <w:t xml:space="preserve">La medición de conversión, suscriptores y retención requiere que la aplicación emita eventos de analítica o que EL CLIENTE facilite los datos de las consolas de App Store y Google Play. Sin esos datos, LA AGENCIA informará solo de los indicadores que pueda medir en redes y en pauta.</w:t>
-      </w:r>
-    </w:p>
-    <w:p>
-      <w:r>
-        <w:br w:type="page"/>
-      </w:r>
-    </w:p>
-    <w:p>
-      <w:pPr>
-        <w:pBdr>
-          <w:bottom w:val="single" w:color="079CB5" w:sz="12" w:space="8"/>
-        </w:pBdr>
-        <w:spacing w:after="60" w:before="0"/>
-      </w:pPr>
-      <w:r>
-        <w:rPr>
-          <w:rFonts w:ascii="Georgia" w:cs="Georgia" w:eastAsia="Georgia" w:hAnsi="Georgia"/>
-          <w:b/>
-          <w:bCs/>
-          <w:color w:val="1B1B1B"/>
-          <w:sz w:val="30"/>
-          <w:szCs w:val="30"/>
-        </w:rPr>
-        <w:t xml:space="preserve">Anexo D · Directorio del proyecto</w:t>
-      </w:r>
-    </w:p>
-    <w:p>
-      <w:pPr>
-        <w:spacing w:after="220"/>
-      </w:pPr>
-      <w:r>
-        <w:rPr>
-          <w:rFonts w:ascii="Calibri" w:cs="Calibri" w:eastAsia="Calibri" w:hAnsi="Calibri"/>
-          <w:color w:val="6E7F82"/>
-          <w:sz w:val="19"/>
-          <w:szCs w:val="19"/>
-        </w:rPr>
-        <w:t xml:space="preserve">Datos de contacto para comunicaciones y notificaciones (cláusulas décima novena y vigésima cuarta).</w:t>
-      </w:r>
-    </w:p>
-    <w:tbl>
-      <w:tblPr>
-        <w:tblW w:type="dxa" w:w="9648"/>
-        <w:tblBorders>
-          <w:top w:val="single" w:color="C7D9DD" w:sz="4"/>
-          <w:left w:val="single" w:color="C7D9DD" w:sz="4"/>
-          <w:bottom w:val="single" w:color="C7D9DD" w:sz="4"/>
-          <w:right w:val="single" w:color="C7D9DD" w:sz="4"/>
-          <w:insideH w:val="single" w:color="C7D9DD" w:sz="2"/>
-          <w:insideV w:val="single" w:color="C7D9DD" w:sz="2"/>
-        </w:tblBorders>
-      </w:tblPr>
-      <w:tblGrid>
-        <w:gridCol w:w="1800"/>
-        <w:gridCol w:w="2348"/>
-        <w:gridCol w:w="1700"/>
-        <w:gridCol w:w="1800"/>
-        <w:gridCol w:w="2000"/>
-      </w:tblGrid>
-      <w:tr>
-        <w:trPr>
-          <w:tblHeader/>
-        </w:trPr>
-        <w:tc>
-          <w:tcPr>
-            <w:tcW w:type="dxa" w:w="1800"/>
+              <w:t xml:space="preserve">C.I.</w:t>
+            </w:r>
+          </w:p>
+        </w:tc>
+        <w:tc>
+          <w:tcPr>
+            <w:tcW w:type="dxa" w:w="1500"/>
             <w:shd w:fill="00677E" w:color="auto" w:val="clear"/>
             <w:tcMar>
               <w:top w:type="dxa" w:w="100"/>
@@ -10420,13 +9139,13 @@
                 <w:sz w:val="16"/>
                 <w:szCs w:val="16"/>
               </w:rPr>
-              <w:t xml:space="preserve">NOMBRE</w:t>
-            </w:r>
-          </w:p>
-        </w:tc>
-        <w:tc>
-          <w:tcPr>
-            <w:tcW w:type="dxa" w:w="2348"/>
+              <w:t xml:space="preserve">TELÉFONO</w:t>
+            </w:r>
+          </w:p>
+        </w:tc>
+        <w:tc>
+          <w:tcPr>
+            <w:tcW w:type="dxa" w:w="2300"/>
             <w:shd w:fill="00677E" w:color="auto" w:val="clear"/>
             <w:tcMar>
               <w:top w:type="dxa" w:w="100"/>
@@ -10449,93 +9168,6 @@
                 <w:sz w:val="16"/>
                 <w:szCs w:val="16"/>
               </w:rPr>
-              <w:t xml:space="preserve">ROL</w:t>
-            </w:r>
-          </w:p>
-        </w:tc>
-        <w:tc>
-          <w:tcPr>
-            <w:tcW w:type="dxa" w:w="1700"/>
-            <w:shd w:fill="00677E" w:color="auto" w:val="clear"/>
-            <w:tcMar>
-              <w:top w:type="dxa" w:w="100"/>
-              <w:left w:type="dxa" w:w="140"/>
-              <w:bottom w:type="dxa" w:w="100"/>
-              <w:right w:type="dxa" w:w="140"/>
-            </w:tcMar>
-          </w:tcPr>
-          <w:p>
-            <w:pPr>
-              <w:spacing w:after="0"/>
-            </w:pPr>
-            <w:r>
-              <w:rPr>
-                <w:rFonts w:ascii="Calibri" w:cs="Calibri" w:eastAsia="Calibri" w:hAnsi="Calibri"/>
-                <w:b/>
-                <w:bCs/>
-                <w:color w:val="FFFFFF"/>
-                <w:spacing w:val="20"/>
-                <w:sz w:val="16"/>
-                <w:szCs w:val="16"/>
-              </w:rPr>
-              <w:t xml:space="preserve">C.I.</w:t>
-            </w:r>
-          </w:p>
-        </w:tc>
-        <w:tc>
-          <w:tcPr>
-            <w:tcW w:type="dxa" w:w="1800"/>
-            <w:shd w:fill="00677E" w:color="auto" w:val="clear"/>
-            <w:tcMar>
-              <w:top w:type="dxa" w:w="100"/>
-              <w:left w:type="dxa" w:w="140"/>
-              <w:bottom w:type="dxa" w:w="100"/>
-              <w:right w:type="dxa" w:w="140"/>
-            </w:tcMar>
-          </w:tcPr>
-          <w:p>
-            <w:pPr>
-              <w:spacing w:after="0"/>
-            </w:pPr>
-            <w:r>
-              <w:rPr>
-                <w:rFonts w:ascii="Calibri" w:cs="Calibri" w:eastAsia="Calibri" w:hAnsi="Calibri"/>
-                <w:b/>
-                <w:bCs/>
-                <w:color w:val="FFFFFF"/>
-                <w:spacing w:val="20"/>
-                <w:sz w:val="16"/>
-                <w:szCs w:val="16"/>
-              </w:rPr>
-              <w:t xml:space="preserve">TELÉFONO</w:t>
-            </w:r>
-          </w:p>
-        </w:tc>
-        <w:tc>
-          <w:tcPr>
-            <w:tcW w:type="dxa" w:w="2000"/>
-            <w:shd w:fill="00677E" w:color="auto" w:val="clear"/>
-            <w:tcMar>
-              <w:top w:type="dxa" w:w="100"/>
-              <w:left w:type="dxa" w:w="140"/>
-              <w:bottom w:type="dxa" w:w="100"/>
-              <w:right w:type="dxa" w:w="140"/>
-            </w:tcMar>
-          </w:tcPr>
-          <w:p>
-            <w:pPr>
-              <w:spacing w:after="0"/>
-            </w:pPr>
-            <w:r>
-              <w:rPr>
-                <w:rFonts w:ascii="Calibri" w:cs="Calibri" w:eastAsia="Calibri" w:hAnsi="Calibri"/>
-                <w:b/>
-                <w:bCs/>
-                <w:color w:val="FFFFFF"/>
-                <w:spacing w:val="20"/>
-                <w:sz w:val="16"/>
-                <w:szCs w:val="16"/>
-              </w:rPr>
               <w:t xml:space="preserve">CORREO</w:t>
             </w:r>
           </w:p>
@@ -10547,7 +9179,7 @@
         </w:trPr>
         <w:tc>
           <w:tcPr>
-            <w:tcW w:type="dxa" w:w="1800"/>
+            <w:tcW w:type="dxa" w:w="2048"/>
             <w:shd w:fill="FFFFFF" w:color="auto" w:val="clear"/>
             <w:tcMar>
               <w:top w:type="dxa" w:w="100"/>
@@ -10567,13 +9199,13 @@
                 <w:sz w:val="19"/>
                 <w:szCs w:val="19"/>
               </w:rPr>
-              <w:t xml:space="preserve">Ninro Libre</w:t>
-            </w:r>
-          </w:p>
-        </w:tc>
-        <w:tc>
-          <w:tcPr>
-            <w:tcW w:type="dxa" w:w="2348"/>
+              <w:t xml:space="preserve">LIBRE G PLATFORMS LLC</w:t>
+            </w:r>
+          </w:p>
+        </w:tc>
+        <w:tc>
+          <w:tcPr>
+            <w:tcW w:type="dxa" w:w="2300"/>
             <w:shd w:fill="FFFFFF" w:color="auto" w:val="clear"/>
             <w:tcMar>
               <w:top w:type="dxa" w:w="100"/>
@@ -10593,13 +9225,13 @@
                 <w:sz w:val="19"/>
                 <w:szCs w:val="19"/>
               </w:rPr>
-              <w:t xml:space="preserve">Cliente · fundador y CEO de Kenia</w:t>
-            </w:r>
-          </w:p>
-        </w:tc>
-        <w:tc>
-          <w:tcPr>
-            <w:tcW w:type="dxa" w:w="1700"/>
+              <w:t xml:space="preserve">Cliente · titular de Kenia</w:t>
+            </w:r>
+          </w:p>
+        </w:tc>
+        <w:tc>
+          <w:tcPr>
+            <w:tcW w:type="dxa" w:w="1500"/>
             <w:shd w:fill="FFFFFF" w:color="auto" w:val="clear"/>
             <w:tcMar>
               <w:top w:type="dxa" w:w="100"/>
@@ -10619,13 +9251,13 @@
                 <w:sz w:val="19"/>
                 <w:szCs w:val="19"/>
               </w:rPr>
-              <w:t xml:space="preserve">__________</w:t>
-            </w:r>
-          </w:p>
-        </w:tc>
-        <w:tc>
-          <w:tcPr>
-            <w:tcW w:type="dxa" w:w="1800"/>
+              <w:t xml:space="preserve">EIN __________</w:t>
+            </w:r>
+          </w:p>
+        </w:tc>
+        <w:tc>
+          <w:tcPr>
+            <w:tcW w:type="dxa" w:w="1500"/>
             <w:shd w:fill="FFFFFF" w:color="auto" w:val="clear"/>
             <w:tcMar>
               <w:top w:type="dxa" w:w="100"/>
@@ -10645,13 +9277,13 @@
                 <w:sz w:val="19"/>
                 <w:szCs w:val="19"/>
               </w:rPr>
-              <w:t xml:space="preserve">__________</w:t>
-            </w:r>
-          </w:p>
-        </w:tc>
-        <w:tc>
-          <w:tcPr>
-            <w:tcW w:type="dxa" w:w="2000"/>
+              <w:t xml:space="preserve">—</w:t>
+            </w:r>
+          </w:p>
+        </w:tc>
+        <w:tc>
+          <w:tcPr>
+            <w:tcW w:type="dxa" w:w="2300"/>
             <w:shd w:fill="FFFFFF" w:color="auto" w:val="clear"/>
             <w:tcMar>
               <w:top w:type="dxa" w:w="100"/>
@@ -10682,7 +9314,7 @@
         </w:trPr>
         <w:tc>
           <w:tcPr>
-            <w:tcW w:type="dxa" w:w="1800"/>
+            <w:tcW w:type="dxa" w:w="2048"/>
             <w:shd w:fill="F2F6F7" w:color="auto" w:val="clear"/>
             <w:tcMar>
               <w:top w:type="dxa" w:w="100"/>
@@ -10702,13 +9334,13 @@
                 <w:sz w:val="19"/>
                 <w:szCs w:val="19"/>
               </w:rPr>
-              <w:t xml:space="preserve">Liam Libre</w:t>
-            </w:r>
-          </w:p>
-        </w:tc>
-        <w:tc>
-          <w:tcPr>
-            <w:tcW w:type="dxa" w:w="2348"/>
+              <w:t xml:space="preserve">Ninro Alexander Libre Guerrero</w:t>
+            </w:r>
+          </w:p>
+        </w:tc>
+        <w:tc>
+          <w:tcPr>
+            <w:tcW w:type="dxa" w:w="2300"/>
             <w:shd w:fill="F2F6F7" w:color="auto" w:val="clear"/>
             <w:tcMar>
               <w:top w:type="dxa" w:w="100"/>
@@ -10728,13 +9360,13 @@
                 <w:sz w:val="19"/>
                 <w:szCs w:val="19"/>
               </w:rPr>
-              <w:t xml:space="preserve">Agencia · Organic Club</w:t>
-            </w:r>
-          </w:p>
-        </w:tc>
-        <w:tc>
-          <w:tcPr>
-            <w:tcW w:type="dxa" w:w="1700"/>
+              <w:t xml:space="preserve">Cliente · representante legal</w:t>
+            </w:r>
+          </w:p>
+        </w:tc>
+        <w:tc>
+          <w:tcPr>
+            <w:tcW w:type="dxa" w:w="1500"/>
             <w:shd w:fill="F2F6F7" w:color="auto" w:val="clear"/>
             <w:tcMar>
               <w:top w:type="dxa" w:w="100"/>
@@ -10760,7 +9392,7 @@
         </w:tc>
         <w:tc>
           <w:tcPr>
-            <w:tcW w:type="dxa" w:w="1800"/>
+            <w:tcW w:type="dxa" w:w="1500"/>
             <w:shd w:fill="F2F6F7" w:color="auto" w:val="clear"/>
             <w:tcMar>
               <w:top w:type="dxa" w:w="100"/>
@@ -10786,7 +9418,7 @@
         </w:tc>
         <w:tc>
           <w:tcPr>
-            <w:tcW w:type="dxa" w:w="2000"/>
+            <w:tcW w:type="dxa" w:w="2300"/>
             <w:shd w:fill="F2F6F7" w:color="auto" w:val="clear"/>
             <w:tcMar>
               <w:top w:type="dxa" w:w="100"/>
@@ -10817,7 +9449,7 @@
         </w:trPr>
         <w:tc>
           <w:tcPr>
-            <w:tcW w:type="dxa" w:w="1800"/>
+            <w:tcW w:type="dxa" w:w="2048"/>
             <w:shd w:fill="FFFFFF" w:color="auto" w:val="clear"/>
             <w:tcMar>
               <w:top w:type="dxa" w:w="100"/>
@@ -10837,13 +9469,13 @@
                 <w:sz w:val="19"/>
                 <w:szCs w:val="19"/>
               </w:rPr>
-              <w:t xml:space="preserve">Alonzo García</w:t>
-            </w:r>
-          </w:p>
-        </w:tc>
-        <w:tc>
-          <w:tcPr>
-            <w:tcW w:type="dxa" w:w="2348"/>
+              <w:t xml:space="preserve">Kurt A. Libre C.</w:t>
+            </w:r>
+          </w:p>
+        </w:tc>
+        <w:tc>
+          <w:tcPr>
+            <w:tcW w:type="dxa" w:w="2300"/>
             <w:shd w:fill="FFFFFF" w:color="auto" w:val="clear"/>
             <w:tcMar>
               <w:top w:type="dxa" w:w="100"/>
@@ -10863,13 +9495,13 @@
                 <w:sz w:val="19"/>
                 <w:szCs w:val="19"/>
               </w:rPr>
-              <w:t xml:space="preserve">Agencia · Organic Club</w:t>
-            </w:r>
-          </w:p>
-        </w:tc>
-        <w:tc>
-          <w:tcPr>
-            <w:tcW w:type="dxa" w:w="1700"/>
+              <w:t xml:space="preserve">Cliente · representante autorizado y contacto técnico</w:t>
+            </w:r>
+          </w:p>
+        </w:tc>
+        <w:tc>
+          <w:tcPr>
+            <w:tcW w:type="dxa" w:w="1500"/>
             <w:shd w:fill="FFFFFF" w:color="auto" w:val="clear"/>
             <w:tcMar>
               <w:top w:type="dxa" w:w="100"/>
@@ -10895,7 +9527,7 @@
         </w:tc>
         <w:tc>
           <w:tcPr>
-            <w:tcW w:type="dxa" w:w="1800"/>
+            <w:tcW w:type="dxa" w:w="1500"/>
             <w:shd w:fill="FFFFFF" w:color="auto" w:val="clear"/>
             <w:tcMar>
               <w:top w:type="dxa" w:w="100"/>
@@ -10921,7 +9553,7 @@
         </w:tc>
         <w:tc>
           <w:tcPr>
-            <w:tcW w:type="dxa" w:w="2000"/>
+            <w:tcW w:type="dxa" w:w="2300"/>
             <w:shd w:fill="FFFFFF" w:color="auto" w:val="clear"/>
             <w:tcMar>
               <w:top w:type="dxa" w:w="100"/>
@@ -10952,7 +9584,7 @@
         </w:trPr>
         <w:tc>
           <w:tcPr>
-            <w:tcW w:type="dxa" w:w="1800"/>
+            <w:tcW w:type="dxa" w:w="2048"/>
             <w:shd w:fill="F2F6F7" w:color="auto" w:val="clear"/>
             <w:tcMar>
               <w:top w:type="dxa" w:w="100"/>
@@ -10972,13 +9604,13 @@
                 <w:sz w:val="19"/>
                 <w:szCs w:val="19"/>
               </w:rPr>
-              <w:t xml:space="preserve">Kurt</w:t>
-            </w:r>
-          </w:p>
-        </w:tc>
-        <w:tc>
-          <w:tcPr>
-            <w:tcW w:type="dxa" w:w="2348"/>
+              <w:t xml:space="preserve">Liam Libre</w:t>
+            </w:r>
+          </w:p>
+        </w:tc>
+        <w:tc>
+          <w:tcPr>
+            <w:tcW w:type="dxa" w:w="2300"/>
             <w:shd w:fill="F2F6F7" w:color="auto" w:val="clear"/>
             <w:tcMar>
               <w:top w:type="dxa" w:w="100"/>
@@ -10998,13 +9630,13 @@
                 <w:sz w:val="19"/>
                 <w:szCs w:val="19"/>
               </w:rPr>
-              <w:t xml:space="preserve">Contacto técnico del cliente · desarrollador</w:t>
-            </w:r>
-          </w:p>
-        </w:tc>
-        <w:tc>
-          <w:tcPr>
-            <w:tcW w:type="dxa" w:w="1700"/>
+              <w:t xml:space="preserve">Agencia · Organic Club</w:t>
+            </w:r>
+          </w:p>
+        </w:tc>
+        <w:tc>
+          <w:tcPr>
+            <w:tcW w:type="dxa" w:w="1500"/>
             <w:shd w:fill="F2F6F7" w:color="auto" w:val="clear"/>
             <w:tcMar>
               <w:top w:type="dxa" w:w="100"/>
@@ -11024,13 +9656,13 @@
                 <w:sz w:val="19"/>
                 <w:szCs w:val="19"/>
               </w:rPr>
-              <w:t xml:space="preserve">—</w:t>
-            </w:r>
-          </w:p>
-        </w:tc>
-        <w:tc>
-          <w:tcPr>
-            <w:tcW w:type="dxa" w:w="1800"/>
+              <w:t xml:space="preserve">__________</w:t>
+            </w:r>
+          </w:p>
+        </w:tc>
+        <w:tc>
+          <w:tcPr>
+            <w:tcW w:type="dxa" w:w="1500"/>
             <w:shd w:fill="F2F6F7" w:color="auto" w:val="clear"/>
             <w:tcMar>
               <w:top w:type="dxa" w:w="100"/>
@@ -11056,8 +9688,143 @@
         </w:tc>
         <w:tc>
           <w:tcPr>
-            <w:tcW w:type="dxa" w:w="2000"/>
+            <w:tcW w:type="dxa" w:w="2300"/>
             <w:shd w:fill="F2F6F7" w:color="auto" w:val="clear"/>
+            <w:tcMar>
+              <w:top w:type="dxa" w:w="100"/>
+              <w:left w:type="dxa" w:w="140"/>
+              <w:bottom w:type="dxa" w:w="100"/>
+              <w:right w:type="dxa" w:w="140"/>
+            </w:tcMar>
+          </w:tcPr>
+          <w:p>
+            <w:pPr>
+              <w:spacing w:after="0" w:line="264"/>
+            </w:pPr>
+            <w:r>
+              <w:rPr>
+                <w:rFonts w:ascii="Calibri" w:cs="Calibri" w:eastAsia="Calibri" w:hAnsi="Calibri"/>
+                <w:color w:val="1B1B1B"/>
+                <w:sz w:val="19"/>
+                <w:szCs w:val="19"/>
+              </w:rPr>
+              <w:t xml:space="preserve">__________</w:t>
+            </w:r>
+          </w:p>
+        </w:tc>
+      </w:tr>
+      <w:tr>
+        <w:trPr>
+          <w:cantSplit/>
+        </w:trPr>
+        <w:tc>
+          <w:tcPr>
+            <w:tcW w:type="dxa" w:w="2048"/>
+            <w:shd w:fill="FFFFFF" w:color="auto" w:val="clear"/>
+            <w:tcMar>
+              <w:top w:type="dxa" w:w="100"/>
+              <w:left w:type="dxa" w:w="140"/>
+              <w:bottom w:type="dxa" w:w="100"/>
+              <w:right w:type="dxa" w:w="140"/>
+            </w:tcMar>
+          </w:tcPr>
+          <w:p>
+            <w:pPr>
+              <w:spacing w:after="0" w:line="264"/>
+            </w:pPr>
+            <w:r>
+              <w:rPr>
+                <w:rFonts w:ascii="Calibri" w:cs="Calibri" w:eastAsia="Calibri" w:hAnsi="Calibri"/>
+                <w:color w:val="1B1B1B"/>
+                <w:sz w:val="19"/>
+                <w:szCs w:val="19"/>
+              </w:rPr>
+              <w:t xml:space="preserve">Alonzo García</w:t>
+            </w:r>
+          </w:p>
+        </w:tc>
+        <w:tc>
+          <w:tcPr>
+            <w:tcW w:type="dxa" w:w="2300"/>
+            <w:shd w:fill="FFFFFF" w:color="auto" w:val="clear"/>
+            <w:tcMar>
+              <w:top w:type="dxa" w:w="100"/>
+              <w:left w:type="dxa" w:w="140"/>
+              <w:bottom w:type="dxa" w:w="100"/>
+              <w:right w:type="dxa" w:w="140"/>
+            </w:tcMar>
+          </w:tcPr>
+          <w:p>
+            <w:pPr>
+              <w:spacing w:after="0" w:line="264"/>
+            </w:pPr>
+            <w:r>
+              <w:rPr>
+                <w:rFonts w:ascii="Calibri" w:cs="Calibri" w:eastAsia="Calibri" w:hAnsi="Calibri"/>
+                <w:color w:val="1B1B1B"/>
+                <w:sz w:val="19"/>
+                <w:szCs w:val="19"/>
+              </w:rPr>
+              <w:t xml:space="preserve">Agencia · Organic Club</w:t>
+            </w:r>
+          </w:p>
+        </w:tc>
+        <w:tc>
+          <w:tcPr>
+            <w:tcW w:type="dxa" w:w="1500"/>
+            <w:shd w:fill="FFFFFF" w:color="auto" w:val="clear"/>
+            <w:tcMar>
+              <w:top w:type="dxa" w:w="100"/>
+              <w:left w:type="dxa" w:w="140"/>
+              <w:bottom w:type="dxa" w:w="100"/>
+              <w:right w:type="dxa" w:w="140"/>
+            </w:tcMar>
+          </w:tcPr>
+          <w:p>
+            <w:pPr>
+              <w:spacing w:after="0" w:line="264"/>
+            </w:pPr>
+            <w:r>
+              <w:rPr>
+                <w:rFonts w:ascii="Calibri" w:cs="Calibri" w:eastAsia="Calibri" w:hAnsi="Calibri"/>
+                <w:color w:val="1B1B1B"/>
+                <w:sz w:val="19"/>
+                <w:szCs w:val="19"/>
+              </w:rPr>
+              <w:t xml:space="preserve">__________</w:t>
+            </w:r>
+          </w:p>
+        </w:tc>
+        <w:tc>
+          <w:tcPr>
+            <w:tcW w:type="dxa" w:w="1500"/>
+            <w:shd w:fill="FFFFFF" w:color="auto" w:val="clear"/>
+            <w:tcMar>
+              <w:top w:type="dxa" w:w="100"/>
+              <w:left w:type="dxa" w:w="140"/>
+              <w:bottom w:type="dxa" w:w="100"/>
+              <w:right w:type="dxa" w:w="140"/>
+            </w:tcMar>
+          </w:tcPr>
+          <w:p>
+            <w:pPr>
+              <w:spacing w:after="0" w:line="264"/>
+            </w:pPr>
+            <w:r>
+              <w:rPr>
+                <w:rFonts w:ascii="Calibri" w:cs="Calibri" w:eastAsia="Calibri" w:hAnsi="Calibri"/>
+                <w:color w:val="1B1B1B"/>
+                <w:sz w:val="19"/>
+                <w:szCs w:val="19"/>
+              </w:rPr>
+              <w:t xml:space="preserve">__________</w:t>
+            </w:r>
+          </w:p>
+        </w:tc>
+        <w:tc>
+          <w:tcPr>
+            <w:tcW w:type="dxa" w:w="2300"/>
+            <w:shd w:fill="FFFFFF" w:color="auto" w:val="clear"/>
             <w:tcMar>
               <w:top w:type="dxa" w:w="100"/>
               <w:left w:type="dxa" w:w="140"/>
@@ -11212,7 +9979,7 @@
                 <w:sz w:val="19"/>
                 <w:szCs w:val="19"/>
               </w:rPr>
-              <w:t xml:space="preserve">Ninro Libre — EL CLIENTE</w:t>
+              <w:t xml:space="preserve">Ninro Alexander Libre Guerrero — EL CLIENTE</w:t>
             </w:r>
           </w:p>
         </w:tc>
@@ -11260,7 +10027,7 @@
                 <w:sz w:val="19"/>
                 <w:szCs w:val="19"/>
               </w:rPr>
-              <w:t xml:space="preserve">Liam Libre — LA AGENCIA</w:t>
+              <w:t xml:space="preserve">Kurt A. Libre C. — EL CLIENTE</w:t>
             </w:r>
           </w:p>
         </w:tc>
@@ -11308,7 +10075,7 @@
                 <w:sz w:val="19"/>
                 <w:szCs w:val="19"/>
               </w:rPr>
-              <w:t xml:space="preserve">Alonzo García — LA AGENCIA</w:t>
+              <w:t xml:space="preserve">Liam Libre — LA AGENCIA</w:t>
             </w:r>
           </w:p>
         </w:tc>
@@ -11316,6 +10083,54 @@
           <w:tcPr>
             <w:tcW w:type="dxa" w:w="3000"/>
             <w:shd w:fill="FFFFFF" w:color="auto" w:val="clear"/>
+            <w:tcMar>
+              <w:top w:type="dxa" w:w="100"/>
+              <w:left w:type="dxa" w:w="140"/>
+              <w:bottom w:type="dxa" w:w="100"/>
+              <w:right w:type="dxa" w:w="140"/>
+            </w:tcMar>
+          </w:tcPr>
+          <w:p>
+            <w:pPr>
+              <w:spacing w:after="0" w:line="264"/>
+            </w:pPr>
+          </w:p>
+        </w:tc>
+      </w:tr>
+      <w:tr>
+        <w:trPr>
+          <w:cantSplit/>
+        </w:trPr>
+        <w:tc>
+          <w:tcPr>
+            <w:tcW w:type="dxa" w:w="6648"/>
+            <w:shd w:fill="F2F6F7" w:color="auto" w:val="clear"/>
+            <w:tcMar>
+              <w:top w:type="dxa" w:w="100"/>
+              <w:left w:type="dxa" w:w="140"/>
+              <w:bottom w:type="dxa" w:w="100"/>
+              <w:right w:type="dxa" w:w="140"/>
+            </w:tcMar>
+          </w:tcPr>
+          <w:p>
+            <w:pPr>
+              <w:spacing w:after="0" w:line="264"/>
+            </w:pPr>
+            <w:r>
+              <w:rPr>
+                <w:rFonts w:ascii="Calibri" w:cs="Calibri" w:eastAsia="Calibri" w:hAnsi="Calibri"/>
+                <w:color w:val="1B1B1B"/>
+                <w:sz w:val="19"/>
+                <w:szCs w:val="19"/>
+              </w:rPr>
+              <w:t xml:space="preserve">Alonzo García — LA AGENCIA</w:t>
+            </w:r>
+          </w:p>
+        </w:tc>
+        <w:tc>
+          <w:tcPr>
+            <w:tcW w:type="dxa" w:w="3000"/>
+            <w:shd w:fill="F2F6F7" w:color="auto" w:val="clear"/>
             <w:tcMar>
               <w:top w:type="dxa" w:w="100"/>
               <w:left w:type="dxa" w:w="140"/>
@@ -11396,7 +10211,7 @@
         <w:sz w:val="15"/>
         <w:szCs w:val="15"/>
       </w:rPr>
-      <w:t xml:space="preserve">Contrato Organic Club × Kenia  ·  Iniciales: ______  ______  ______  ·  Página </w:t>
+      <w:t xml:space="preserve">Contrato Organic Club × Kenia  ·  Iniciales: _____  _____  _____  _____  ·  Página </w:t>
     </w:r>
     <w:r>
       <w:rPr>

</xml_diff>